<commit_message>
Restyle Homelab_DevPod_on_Skynet_Runbook.docx to combined Word style
Regenerated with the combined style (2026-10-03 darker text on blue shading) and added the required header caption and footer with right-aligned page numbers.
</commit_message>
<xml_diff>
--- a/docs/Homelab_DevPod_on_Skynet_Runbook.docx
+++ b/docs/Homelab_DevPod_on_Skynet_Runbook.docx
@@ -4,26 +4,33 @@
   <w:body>
     <w:p>
       <w:pPr>
-        <w:jc w:val="left"/>
+        <w:pStyle w:val="Title"/>
       </w:pPr>
       <w:r>
-        <w:rPr>
-          <w:b/>
-          <w:sz w:val="40"/>
-        </w:rPr>
         <w:t>Homelab DevPod on Skynet Runbook</w:t>
       </w:r>
     </w:p>
     <w:p>
+      <w:pPr>
+        <w:pStyle w:val="Subtitle"/>
+      </w:pPr>
       <w:r>
-        <w:rPr>
-          <w:i/>
-        </w:rPr>
         <w:t>Homelab cluster skynet · jameshomelab.org · DevPod Kubernetes provider + Longhorn + SMB scratch</w:t>
       </w:r>
     </w:p>
     <w:p>
+      <w:pPr>
+        <w:shd w:val="clear" w:color="auto" w:fill="F0F4F7"/>
+        <w:pBdr>
+          <w:left w:val="single" w:sz="24" w:space="6" w:color="4F81BD"/>
+        </w:pBdr>
+        <w:spacing w:after="200"/>
+      </w:pPr>
       <w:r>
+        <w:rPr>
+          <w:color w:val="333333"/>
+          <w:sz w:val="20"/>
+        </w:rPr>
         <w:t>Completed / verified: 2026-09-12–13 · Flux apps/base/devpod · workspace cluster-dashboard Running · preferred editor: vim over SSH</w:t>
       </w:r>
     </w:p>
@@ -111,24 +118,49 @@
     </w:p>
     <w:tbl>
       <w:tblPr>
-        <w:tblStyle w:val="TableGrid"/>
+        <w:tblStyle w:val="LightShading-Accent1"/>
         <w:tblW w:type="auto" w:w="0"/>
+        <w:tblLayout w:type="fixed"/>
         <w:tblLook w:firstColumn="1" w:firstRow="1" w:lastColumn="0" w:lastRow="0" w:noHBand="0" w:noVBand="1" w:val="04A0"/>
+        <w:tblBorders>
+          <w:top w:val="single" w:sz="8" w:space="0" w:color="4F81BD"/>
+          <w:left w:val="nil"/>
+          <w:bottom w:val="single" w:sz="8" w:space="0" w:color="4F81BD"/>
+          <w:right w:val="nil"/>
+          <w:insideH w:val="nil"/>
+          <w:insideV w:val="nil"/>
+        </w:tblBorders>
       </w:tblPr>
       <w:tblGrid>
-        <w:gridCol w:w="2880"/>
-        <w:gridCol w:w="2880"/>
-        <w:gridCol w:w="2880"/>
+        <w:gridCol w:w="3360"/>
+        <w:gridCol w:w="3360"/>
+        <w:gridCol w:w="3360"/>
       </w:tblGrid>
       <w:tr>
+        <w:trPr>
+          <w:cantSplit/>
+          <w:tblHeader w:val="true"/>
+        </w:trPr>
         <w:tc>
           <w:tcPr>
-            <w:tcW w:type="dxa" w:w="2880"/>
+            <w:tcW w:type="dxa" w:w="3360"/>
+            <w:tcBorders>
+              <w:top w:val="single" w:sz="8" w:space="0" w:color="4F81BD"/>
+              <w:bottom w:val="single" w:sz="8" w:space="0" w:color="4F81BD"/>
+            </w:tcBorders>
+            <w:shd w:val="clear" w:color="auto" w:fill="365F91"/>
           </w:tcPr>
           <w:p>
+            <w:pPr>
+              <w:keepNext/>
+              <w:spacing w:before="40" w:after="40" w:line="240" w:lineRule="auto"/>
+            </w:pPr>
+            <w:r/>
             <w:r>
               <w:rPr>
                 <w:b/>
+                <w:color w:val="FFFFFF"/>
+                <w:sz w:val="20"/>
               </w:rPr>
               <w:t>Layer</w:t>
             </w:r>
@@ -136,12 +168,24 @@
         </w:tc>
         <w:tc>
           <w:tcPr>
-            <w:tcW w:type="dxa" w:w="2880"/>
+            <w:tcW w:type="dxa" w:w="3360"/>
+            <w:tcBorders>
+              <w:top w:val="single" w:sz="8" w:space="0" w:color="4F81BD"/>
+              <w:bottom w:val="single" w:sz="8" w:space="0" w:color="4F81BD"/>
+            </w:tcBorders>
+            <w:shd w:val="clear" w:color="auto" w:fill="365F91"/>
           </w:tcPr>
           <w:p>
+            <w:pPr>
+              <w:keepNext/>
+              <w:spacing w:before="40" w:after="40" w:line="240" w:lineRule="auto"/>
+            </w:pPr>
+            <w:r/>
             <w:r>
               <w:rPr>
                 <w:b/>
+                <w:color w:val="FFFFFF"/>
+                <w:sz w:val="20"/>
               </w:rPr>
               <w:t>What</w:t>
             </w:r>
@@ -149,12 +193,24 @@
         </w:tc>
         <w:tc>
           <w:tcPr>
-            <w:tcW w:type="dxa" w:w="2880"/>
+            <w:tcW w:type="dxa" w:w="3360"/>
+            <w:tcBorders>
+              <w:top w:val="single" w:sz="8" w:space="0" w:color="4F81BD"/>
+              <w:bottom w:val="single" w:sz="8" w:space="0" w:color="4F81BD"/>
+            </w:tcBorders>
+            <w:shd w:val="clear" w:color="auto" w:fill="365F91"/>
           </w:tcPr>
           <w:p>
+            <w:pPr>
+              <w:keepNext/>
+              <w:spacing w:before="40" w:after="40" w:line="240" w:lineRule="auto"/>
+            </w:pPr>
+            <w:r/>
             <w:r>
               <w:rPr>
                 <w:b/>
+                <w:color w:val="FFFFFF"/>
+                <w:sz w:val="20"/>
               </w:rPr>
               <w:t>Where</w:t>
             </w:r>
@@ -162,199 +218,389 @@
         </w:tc>
       </w:tr>
       <w:tr>
+        <w:trPr>
+          <w:cantSplit/>
+        </w:trPr>
         <w:tc>
           <w:tcPr>
-            <w:tcW w:type="dxa" w:w="2880"/>
+            <w:tcW w:type="dxa" w:w="3360"/>
+            <w:shd w:val="clear" w:color="auto" w:fill="D3DFEE"/>
           </w:tcPr>
           <w:p>
+            <w:pPr>
+              <w:spacing w:before="40" w:after="40" w:line="240" w:lineRule="auto"/>
+            </w:pPr>
+            <w:r/>
             <w:r>
+              <w:rPr>
+                <w:b/>
+                <w:color w:val="173A53"/>
+                <w:sz w:val="20"/>
+              </w:rPr>
               <w:t>GitOps ns/quota</w:t>
             </w:r>
           </w:p>
         </w:tc>
         <w:tc>
           <w:tcPr>
-            <w:tcW w:type="dxa" w:w="2880"/>
+            <w:tcW w:type="dxa" w:w="3360"/>
+            <w:shd w:val="clear" w:color="auto" w:fill="D3DFEE"/>
           </w:tcPr>
           <w:p>
+            <w:pPr>
+              <w:spacing w:before="40" w:after="40" w:line="240" w:lineRule="auto"/>
+            </w:pPr>
+            <w:r/>
             <w:r>
+              <w:rPr>
+                <w:color w:val="1A1A1A"/>
+                <w:sz w:val="20"/>
+              </w:rPr>
               <w:t>Namespace + ResourceQuota + LimitRange</w:t>
             </w:r>
           </w:p>
         </w:tc>
         <w:tc>
           <w:tcPr>
-            <w:tcW w:type="dxa" w:w="2880"/>
+            <w:tcW w:type="dxa" w:w="3360"/>
+            <w:shd w:val="clear" w:color="auto" w:fill="D3DFEE"/>
           </w:tcPr>
           <w:p>
+            <w:pPr>
+              <w:spacing w:before="40" w:after="40" w:line="240" w:lineRule="auto"/>
+            </w:pPr>
+            <w:r/>
             <w:r>
+              <w:rPr>
+                <w:color w:val="1A1A1A"/>
+                <w:sz w:val="20"/>
+              </w:rPr>
               <w:t>apps/base/devpod + apps/staging/devpod</w:t>
             </w:r>
           </w:p>
         </w:tc>
       </w:tr>
       <w:tr>
+        <w:trPr>
+          <w:cantSplit/>
+        </w:trPr>
         <w:tc>
           <w:tcPr>
-            <w:tcW w:type="dxa" w:w="2880"/>
+            <w:tcW w:type="dxa" w:w="3360"/>
+            <w:shd w:val="clear" w:color="auto" w:fill="FFFFFF"/>
           </w:tcPr>
           <w:p>
+            <w:pPr>
+              <w:spacing w:before="40" w:after="40" w:line="240" w:lineRule="auto"/>
+            </w:pPr>
+            <w:r/>
             <w:r>
+              <w:rPr>
+                <w:b/>
+                <w:color w:val="173A53"/>
+                <w:sz w:val="20"/>
+              </w:rPr>
               <w:t>Workspace PVC</w:t>
             </w:r>
           </w:p>
         </w:tc>
         <w:tc>
           <w:tcPr>
-            <w:tcW w:type="dxa" w:w="2880"/>
+            <w:tcW w:type="dxa" w:w="3360"/>
+            <w:shd w:val="clear" w:color="auto" w:fill="FFFFFF"/>
           </w:tcPr>
           <w:p>
+            <w:pPr>
+              <w:spacing w:before="40" w:after="40" w:line="240" w:lineRule="auto"/>
+            </w:pPr>
+            <w:r/>
             <w:r>
+              <w:rPr>
+                <w:color w:val="1A1A1A"/>
+                <w:sz w:val="20"/>
+              </w:rPr>
               <w:t>Longhorn 40Gi RWO per workspace</w:t>
             </w:r>
           </w:p>
         </w:tc>
         <w:tc>
           <w:tcPr>
-            <w:tcW w:type="dxa" w:w="2880"/>
+            <w:tcW w:type="dxa" w:w="3360"/>
+            <w:shd w:val="clear" w:color="auto" w:fill="FFFFFF"/>
           </w:tcPr>
           <w:p>
+            <w:pPr>
+              <w:spacing w:before="40" w:after="40" w:line="240" w:lineRule="auto"/>
+            </w:pPr>
+            <w:r/>
             <w:r>
+              <w:rPr>
+                <w:color w:val="1A1A1A"/>
+                <w:sz w:val="20"/>
+              </w:rPr>
               <w:t>Created by DevPod in ns devpod</w:t>
             </w:r>
           </w:p>
         </w:tc>
       </w:tr>
       <w:tr>
+        <w:trPr>
+          <w:cantSplit/>
+        </w:trPr>
         <w:tc>
           <w:tcPr>
-            <w:tcW w:type="dxa" w:w="2880"/>
+            <w:tcW w:type="dxa" w:w="3360"/>
+            <w:shd w:val="clear" w:color="auto" w:fill="D3DFEE"/>
           </w:tcPr>
           <w:p>
+            <w:pPr>
+              <w:spacing w:before="40" w:after="40" w:line="240" w:lineRule="auto"/>
+            </w:pPr>
+            <w:r/>
             <w:r>
+              <w:rPr>
+                <w:b/>
+                <w:color w:val="173A53"/>
+                <w:sz w:val="20"/>
+              </w:rPr>
               <w:t>Scratch PVC</w:t>
             </w:r>
           </w:p>
         </w:tc>
         <w:tc>
           <w:tcPr>
-            <w:tcW w:type="dxa" w:w="2880"/>
+            <w:tcW w:type="dxa" w:w="3360"/>
+            <w:shd w:val="clear" w:color="auto" w:fill="D3DFEE"/>
           </w:tcPr>
           <w:p>
+            <w:pPr>
+              <w:spacing w:before="40" w:after="40" w:line="240" w:lineRule="auto"/>
+            </w:pPr>
+            <w:r/>
             <w:r>
+              <w:rPr>
+                <w:color w:val="1A1A1A"/>
+                <w:sz w:val="20"/>
+              </w:rPr>
               <w:t>500Gi RWX SMB DevStorage</w:t>
             </w:r>
           </w:p>
         </w:tc>
         <w:tc>
           <w:tcPr>
-            <w:tcW w:type="dxa" w:w="2880"/>
+            <w:tcW w:type="dxa" w:w="3360"/>
+            <w:shd w:val="clear" w:color="auto" w:fill="D3DFEE"/>
           </w:tcPr>
           <w:p>
+            <w:pPr>
+              <w:spacing w:before="40" w:after="40" w:line="240" w:lineRule="auto"/>
+            </w:pPr>
+            <w:r/>
             <w:r>
+              <w:rPr>
+                <w:color w:val="1A1A1A"/>
+                <w:sz w:val="20"/>
+              </w:rPr>
               <w:t>PVC devpod/devpod-scratch</w:t>
             </w:r>
           </w:p>
         </w:tc>
       </w:tr>
       <w:tr>
+        <w:trPr>
+          <w:cantSplit/>
+        </w:trPr>
         <w:tc>
           <w:tcPr>
-            <w:tcW w:type="dxa" w:w="2880"/>
+            <w:tcW w:type="dxa" w:w="3360"/>
+            <w:shd w:val="clear" w:color="auto" w:fill="FFFFFF"/>
           </w:tcPr>
           <w:p>
+            <w:pPr>
+              <w:spacing w:before="40" w:after="40" w:line="240" w:lineRule="auto"/>
+            </w:pPr>
+            <w:r/>
             <w:r>
+              <w:rPr>
+                <w:b/>
+                <w:color w:val="173A53"/>
+                <w:sz w:val="20"/>
+              </w:rPr>
               <w:t>Provider</w:t>
             </w:r>
           </w:p>
         </w:tc>
         <w:tc>
           <w:tcPr>
-            <w:tcW w:type="dxa" w:w="2880"/>
+            <w:tcW w:type="dxa" w:w="3360"/>
+            <w:shd w:val="clear" w:color="auto" w:fill="FFFFFF"/>
           </w:tcPr>
           <w:p>
+            <w:pPr>
+              <w:spacing w:before="40" w:after="40" w:line="240" w:lineRule="auto"/>
+            </w:pPr>
+            <w:r/>
             <w:r>
+              <w:rPr>
+                <w:color w:val="1A1A1A"/>
+                <w:sz w:val="20"/>
+              </w:rPr>
               <w:t>kubernetes provider named skynet</w:t>
             </w:r>
           </w:p>
         </w:tc>
         <w:tc>
           <w:tcPr>
-            <w:tcW w:type="dxa" w:w="2880"/>
+            <w:tcW w:type="dxa" w:w="3360"/>
+            <w:shd w:val="clear" w:color="auto" w:fill="FFFFFF"/>
           </w:tcPr>
           <w:p>
+            <w:pPr>
+              <w:spacing w:before="40" w:after="40" w:line="240" w:lineRule="auto"/>
+            </w:pPr>
+            <w:r/>
             <w:r>
+              <w:rPr>
+                <w:color w:val="1A1A1A"/>
+                <w:sz w:val="20"/>
+              </w:rPr>
               <w:t>M5 DevPod config</w:t>
             </w:r>
           </w:p>
         </w:tc>
       </w:tr>
       <w:tr>
+        <w:trPr>
+          <w:cantSplit/>
+        </w:trPr>
         <w:tc>
           <w:tcPr>
-            <w:tcW w:type="dxa" w:w="2880"/>
+            <w:tcW w:type="dxa" w:w="3360"/>
+            <w:shd w:val="clear" w:color="auto" w:fill="D3DFEE"/>
           </w:tcPr>
           <w:p>
+            <w:pPr>
+              <w:spacing w:before="40" w:after="40" w:line="240" w:lineRule="auto"/>
+            </w:pPr>
+            <w:r/>
             <w:r>
+              <w:rPr>
+                <w:b/>
+                <w:color w:val="173A53"/>
+                <w:sz w:val="20"/>
+              </w:rPr>
               <w:t>Scratch mount</w:t>
             </w:r>
           </w:p>
         </w:tc>
         <w:tc>
           <w:tcPr>
-            <w:tcW w:type="dxa" w:w="2880"/>
+            <w:tcW w:type="dxa" w:w="3360"/>
+            <w:shd w:val="clear" w:color="auto" w:fill="D3DFEE"/>
           </w:tcPr>
           <w:p>
+            <w:pPr>
+              <w:spacing w:before="40" w:after="40" w:line="240" w:lineRule="auto"/>
+            </w:pPr>
+            <w:r/>
             <w:r>
+              <w:rPr>
+                <w:color w:val="1A1A1A"/>
+                <w:sz w:val="20"/>
+              </w:rPr>
               <w:t>volumeMount /scratch</w:t>
             </w:r>
           </w:p>
         </w:tc>
         <w:tc>
           <w:tcPr>
-            <w:tcW w:type="dxa" w:w="2880"/>
+            <w:tcW w:type="dxa" w:w="3360"/>
+            <w:shd w:val="clear" w:color="auto" w:fill="D3DFEE"/>
           </w:tcPr>
           <w:p>
+            <w:pPr>
+              <w:spacing w:before="40" w:after="40" w:line="240" w:lineRule="auto"/>
+            </w:pPr>
+            <w:r/>
             <w:r>
+              <w:rPr>
+                <w:color w:val="1A1A1A"/>
+                <w:sz w:val="20"/>
+              </w:rPr>
               <w:t>~/.config/devpod/skynet-pod-template.yaml</w:t>
             </w:r>
           </w:p>
         </w:tc>
       </w:tr>
       <w:tr>
+        <w:trPr>
+          <w:cantSplit/>
+        </w:trPr>
         <w:tc>
           <w:tcPr>
-            <w:tcW w:type="dxa" w:w="2880"/>
+            <w:tcW w:type="dxa" w:w="3360"/>
+            <w:shd w:val="clear" w:color="auto" w:fill="FFFFFF"/>
           </w:tcPr>
           <w:p>
+            <w:pPr>
+              <w:spacing w:before="40" w:after="40" w:line="240" w:lineRule="auto"/>
+            </w:pPr>
+            <w:r/>
             <w:r>
+              <w:rPr>
+                <w:b/>
+                <w:color w:val="173A53"/>
+                <w:sz w:val="20"/>
+              </w:rPr>
               <w:t>Example workspace</w:t>
             </w:r>
           </w:p>
         </w:tc>
         <w:tc>
           <w:tcPr>
-            <w:tcW w:type="dxa" w:w="2880"/>
+            <w:tcW w:type="dxa" w:w="3360"/>
+            <w:shd w:val="clear" w:color="auto" w:fill="FFFFFF"/>
           </w:tcPr>
           <w:p>
+            <w:pPr>
+              <w:spacing w:before="40" w:after="40" w:line="240" w:lineRule="auto"/>
+            </w:pPr>
+            <w:r/>
             <w:r>
+              <w:rPr>
+                <w:color w:val="1A1A1A"/>
+                <w:sz w:val="20"/>
+              </w:rPr>
               <w:t>cluster-dashboard (FastAPI stub)</w:t>
             </w:r>
           </w:p>
         </w:tc>
         <w:tc>
           <w:tcPr>
-            <w:tcW w:type="dxa" w:w="2880"/>
+            <w:tcW w:type="dxa" w:w="3360"/>
+            <w:shd w:val="clear" w:color="auto" w:fill="FFFFFF"/>
           </w:tcPr>
           <w:p>
+            <w:pPr>
+              <w:spacing w:before="40" w:after="40" w:line="240" w:lineRule="auto"/>
+            </w:pPr>
+            <w:r/>
             <w:r>
+              <w:rPr>
+                <w:color w:val="1A1A1A"/>
+                <w:sz w:val="20"/>
+              </w:rPr>
               <w:t>github.com/Invertedlight/cluster-dashboard</w:t>
             </w:r>
           </w:p>
         </w:tc>
       </w:tr>
     </w:tbl>
-    <w:p/>
+    <w:p>
+      <w:pPr>
+        <w:spacing w:after="40" w:line="120" w:lineRule="exact"/>
+      </w:pPr>
+    </w:p>
     <w:p>
       <w:pPr>
         <w:pStyle w:val="Heading1"/>
@@ -397,24 +643,49 @@
     </w:p>
     <w:tbl>
       <w:tblPr>
-        <w:tblStyle w:val="TableGrid"/>
+        <w:tblStyle w:val="LightShading-Accent1"/>
         <w:tblW w:type="auto" w:w="0"/>
+        <w:tblLayout w:type="fixed"/>
         <w:tblLook w:firstColumn="1" w:firstRow="1" w:lastColumn="0" w:lastRow="0" w:noHBand="0" w:noVBand="1" w:val="04A0"/>
+        <w:tblBorders>
+          <w:top w:val="single" w:sz="8" w:space="0" w:color="4F81BD"/>
+          <w:left w:val="nil"/>
+          <w:bottom w:val="single" w:sz="8" w:space="0" w:color="4F81BD"/>
+          <w:right w:val="nil"/>
+          <w:insideH w:val="nil"/>
+          <w:insideV w:val="nil"/>
+        </w:tblBorders>
       </w:tblPr>
       <w:tblGrid>
-        <w:gridCol w:w="2880"/>
-        <w:gridCol w:w="2880"/>
-        <w:gridCol w:w="2880"/>
+        <w:gridCol w:w="3360"/>
+        <w:gridCol w:w="3360"/>
+        <w:gridCol w:w="3360"/>
       </w:tblGrid>
       <w:tr>
+        <w:trPr>
+          <w:cantSplit/>
+          <w:tblHeader w:val="true"/>
+        </w:trPr>
         <w:tc>
           <w:tcPr>
-            <w:tcW w:type="dxa" w:w="2880"/>
+            <w:tcW w:type="dxa" w:w="3360"/>
+            <w:tcBorders>
+              <w:top w:val="single" w:sz="8" w:space="0" w:color="4F81BD"/>
+              <w:bottom w:val="single" w:sz="8" w:space="0" w:color="4F81BD"/>
+            </w:tcBorders>
+            <w:shd w:val="clear" w:color="auto" w:fill="365F91"/>
           </w:tcPr>
           <w:p>
+            <w:pPr>
+              <w:keepNext/>
+              <w:spacing w:before="40" w:after="40" w:line="240" w:lineRule="auto"/>
+            </w:pPr>
+            <w:r/>
             <w:r>
               <w:rPr>
                 <w:b/>
+                <w:color w:val="FFFFFF"/>
+                <w:sz w:val="20"/>
               </w:rPr>
               <w:t>Use</w:t>
             </w:r>
@@ -422,12 +693,24 @@
         </w:tc>
         <w:tc>
           <w:tcPr>
-            <w:tcW w:type="dxa" w:w="2880"/>
+            <w:tcW w:type="dxa" w:w="3360"/>
+            <w:tcBorders>
+              <w:top w:val="single" w:sz="8" w:space="0" w:color="4F81BD"/>
+              <w:bottom w:val="single" w:sz="8" w:space="0" w:color="4F81BD"/>
+            </w:tcBorders>
+            <w:shd w:val="clear" w:color="auto" w:fill="365F91"/>
           </w:tcPr>
           <w:p>
+            <w:pPr>
+              <w:keepNext/>
+              <w:spacing w:before="40" w:after="40" w:line="240" w:lineRule="auto"/>
+            </w:pPr>
+            <w:r/>
             <w:r>
               <w:rPr>
                 <w:b/>
+                <w:color w:val="FFFFFF"/>
+                <w:sz w:val="20"/>
               </w:rPr>
               <w:t>Backend</w:t>
             </w:r>
@@ -435,12 +718,24 @@
         </w:tc>
         <w:tc>
           <w:tcPr>
-            <w:tcW w:type="dxa" w:w="2880"/>
+            <w:tcW w:type="dxa" w:w="3360"/>
+            <w:tcBorders>
+              <w:top w:val="single" w:sz="8" w:space="0" w:color="4F81BD"/>
+              <w:bottom w:val="single" w:sz="8" w:space="0" w:color="4F81BD"/>
+            </w:tcBorders>
+            <w:shd w:val="clear" w:color="auto" w:fill="365F91"/>
           </w:tcPr>
           <w:p>
+            <w:pPr>
+              <w:keepNext/>
+              <w:spacing w:before="40" w:after="40" w:line="240" w:lineRule="auto"/>
+            </w:pPr>
+            <w:r/>
             <w:r>
               <w:rPr>
                 <w:b/>
+                <w:color w:val="FFFFFF"/>
+                <w:sz w:val="20"/>
               </w:rPr>
               <w:t>Notes</w:t>
             </w:r>
@@ -448,199 +743,389 @@
         </w:tc>
       </w:tr>
       <w:tr>
+        <w:trPr>
+          <w:cantSplit/>
+        </w:trPr>
         <w:tc>
           <w:tcPr>
-            <w:tcW w:type="dxa" w:w="2880"/>
+            <w:tcW w:type="dxa" w:w="3360"/>
+            <w:shd w:val="clear" w:color="auto" w:fill="D3DFEE"/>
           </w:tcPr>
           <w:p>
+            <w:pPr>
+              <w:spacing w:before="40" w:after="40" w:line="240" w:lineRule="auto"/>
+            </w:pPr>
+            <w:r/>
             <w:r>
+              <w:rPr>
+                <w:b/>
+                <w:color w:val="173A53"/>
+                <w:sz w:val="20"/>
+              </w:rPr>
               <w:t>DevPod workspace (code/IDE state on PVC)</w:t>
             </w:r>
           </w:p>
         </w:tc>
         <w:tc>
           <w:tcPr>
-            <w:tcW w:type="dxa" w:w="2880"/>
+            <w:tcW w:type="dxa" w:w="3360"/>
+            <w:shd w:val="clear" w:color="auto" w:fill="D3DFEE"/>
           </w:tcPr>
           <w:p>
+            <w:pPr>
+              <w:spacing w:before="40" w:after="40" w:line="240" w:lineRule="auto"/>
+            </w:pPr>
+            <w:r/>
             <w:r>
+              <w:rPr>
+                <w:color w:val="1A1A1A"/>
+                <w:sz w:val="20"/>
+              </w:rPr>
               <w:t>Longhorn RWO ~40Gi</w:t>
             </w:r>
           </w:p>
         </w:tc>
         <w:tc>
           <w:tcPr>
-            <w:tcW w:type="dxa" w:w="2880"/>
+            <w:tcW w:type="dxa" w:w="3360"/>
+            <w:shd w:val="clear" w:color="auto" w:fill="D3DFEE"/>
           </w:tcPr>
           <w:p>
+            <w:pPr>
+              <w:spacing w:before="40" w:after="40" w:line="240" w:lineRule="auto"/>
+            </w:pPr>
+            <w:r/>
             <w:r>
+              <w:rPr>
+                <w:color w:val="1A1A1A"/>
+                <w:sz w:val="20"/>
+              </w:rPr>
               <w:t>Not SMB — git/IDE hate flaky USB/SMB</w:t>
             </w:r>
           </w:p>
         </w:tc>
       </w:tr>
       <w:tr>
+        <w:trPr>
+          <w:cantSplit/>
+        </w:trPr>
         <w:tc>
           <w:tcPr>
-            <w:tcW w:type="dxa" w:w="2880"/>
+            <w:tcW w:type="dxa" w:w="3360"/>
+            <w:shd w:val="clear" w:color="auto" w:fill="FFFFFF"/>
           </w:tcPr>
           <w:p>
+            <w:pPr>
+              <w:spacing w:before="40" w:after="40" w:line="240" w:lineRule="auto"/>
+            </w:pPr>
+            <w:r/>
             <w:r>
+              <w:rPr>
+                <w:b/>
+                <w:color w:val="173A53"/>
+                <w:sz w:val="20"/>
+              </w:rPr>
               <w:t>Home ~/.cursor-server (if Cursor used)</w:t>
             </w:r>
           </w:p>
         </w:tc>
         <w:tc>
           <w:tcPr>
-            <w:tcW w:type="dxa" w:w="2880"/>
+            <w:tcW w:type="dxa" w:w="3360"/>
+            <w:shd w:val="clear" w:color="auto" w:fill="FFFFFF"/>
           </w:tcPr>
           <w:p>
+            <w:pPr>
+              <w:spacing w:before="40" w:after="40" w:line="240" w:lineRule="auto"/>
+            </w:pPr>
+            <w:r/>
             <w:r>
+              <w:rPr>
+                <w:color w:val="1A1A1A"/>
+                <w:sz w:val="20"/>
+              </w:rPr>
               <w:t>Container overlay on node disk</w:t>
             </w:r>
           </w:p>
         </w:tc>
         <w:tc>
           <w:tcPr>
-            <w:tcW w:type="dxa" w:w="2880"/>
+            <w:tcW w:type="dxa" w:w="3360"/>
+            <w:shd w:val="clear" w:color="auto" w:fill="FFFFFF"/>
           </w:tcPr>
           <w:p>
+            <w:pPr>
+              <w:spacing w:before="40" w:after="40" w:line="240" w:lineRule="auto"/>
+            </w:pPr>
+            <w:r/>
             <w:r>
+              <w:rPr>
+                <w:color w:val="1A1A1A"/>
+                <w:sz w:val="20"/>
+              </w:rPr>
               <w:t>Ephemeral to the node/pod; not the 40Gi PVC</w:t>
             </w:r>
           </w:p>
         </w:tc>
       </w:tr>
       <w:tr>
+        <w:trPr>
+          <w:cantSplit/>
+        </w:trPr>
         <w:tc>
           <w:tcPr>
-            <w:tcW w:type="dxa" w:w="2880"/>
+            <w:tcW w:type="dxa" w:w="3360"/>
+            <w:shd w:val="clear" w:color="auto" w:fill="D3DFEE"/>
           </w:tcPr>
           <w:p>
+            <w:pPr>
+              <w:spacing w:before="40" w:after="40" w:line="240" w:lineRule="auto"/>
+            </w:pPr>
+            <w:r/>
             <w:r>
+              <w:rPr>
+                <w:b/>
+                <w:color w:val="173A53"/>
+                <w:sz w:val="20"/>
+              </w:rPr>
               <w:t>On/off scratch (builds, datasets)</w:t>
             </w:r>
           </w:p>
         </w:tc>
         <w:tc>
           <w:tcPr>
-            <w:tcW w:type="dxa" w:w="2880"/>
+            <w:tcW w:type="dxa" w:w="3360"/>
+            <w:shd w:val="clear" w:color="auto" w:fill="D3DFEE"/>
           </w:tcPr>
           <w:p>
+            <w:pPr>
+              <w:spacing w:before="40" w:after="40" w:line="240" w:lineRule="auto"/>
+            </w:pPr>
+            <w:r/>
             <w:r>
+              <w:rPr>
+                <w:color w:val="1A1A1A"/>
+                <w:sz w:val="20"/>
+              </w:rPr>
               <w:t>SMB 32TB_SSD DevStorage via /scratch</w:t>
             </w:r>
           </w:p>
         </w:tc>
         <w:tc>
           <w:tcPr>
-            <w:tcW w:type="dxa" w:w="2880"/>
+            <w:tcW w:type="dxa" w:w="3360"/>
+            <w:shd w:val="clear" w:color="auto" w:fill="D3DFEE"/>
           </w:tcPr>
           <w:p>
+            <w:pPr>
+              <w:spacing w:before="40" w:after="40" w:line="240" w:lineRule="auto"/>
+            </w:pPr>
+            <w:r/>
             <w:r>
+              <w:rPr>
+                <w:color w:val="1A1A1A"/>
+                <w:sz w:val="20"/>
+              </w:rPr>
               <w:t>Disposable; CSI direct to appliance</w:t>
             </w:r>
           </w:p>
         </w:tc>
       </w:tr>
       <w:tr>
+        <w:trPr>
+          <w:cantSplit/>
+        </w:trPr>
         <w:tc>
           <w:tcPr>
-            <w:tcW w:type="dxa" w:w="2880"/>
+            <w:tcW w:type="dxa" w:w="3360"/>
+            <w:shd w:val="clear" w:color="auto" w:fill="FFFFFF"/>
           </w:tcPr>
           <w:p>
+            <w:pPr>
+              <w:spacing w:before="40" w:after="40" w:line="240" w:lineRule="auto"/>
+            </w:pPr>
+            <w:r/>
             <w:r>
+              <w:rPr>
+                <w:b/>
+                <w:color w:val="173A53"/>
+                <w:sz w:val="20"/>
+              </w:rPr>
               <w:t>Dashboard app blobs (not Postgres)</w:t>
             </w:r>
           </w:p>
         </w:tc>
         <w:tc>
           <w:tcPr>
-            <w:tcW w:type="dxa" w:w="2880"/>
+            <w:tcW w:type="dxa" w:w="3360"/>
+            <w:shd w:val="clear" w:color="auto" w:fill="FFFFFF"/>
           </w:tcPr>
           <w:p>
+            <w:pPr>
+              <w:spacing w:before="40" w:after="40" w:line="240" w:lineRule="auto"/>
+            </w:pPr>
+            <w:r/>
             <w:r>
+              <w:rPr>
+                <w:color w:val="1A1A1A"/>
+                <w:sz w:val="20"/>
+              </w:rPr>
               <w:t>Longhorn (when deployed)</w:t>
             </w:r>
           </w:p>
         </w:tc>
         <w:tc>
           <w:tcPr>
-            <w:tcW w:type="dxa" w:w="2880"/>
+            <w:tcW w:type="dxa" w:w="3360"/>
+            <w:shd w:val="clear" w:color="auto" w:fill="FFFFFF"/>
           </w:tcPr>
           <w:p>
+            <w:pPr>
+              <w:spacing w:before="40" w:after="40" w:line="240" w:lineRule="auto"/>
+            </w:pPr>
+            <w:r/>
             <w:r>
+              <w:rPr>
+                <w:color w:val="1A1A1A"/>
+                <w:sz w:val="20"/>
+              </w:rPr>
               <w:t>Matches Mealie/Linkding pattern</w:t>
             </w:r>
           </w:p>
         </w:tc>
       </w:tr>
       <w:tr>
+        <w:trPr>
+          <w:cantSplit/>
+        </w:trPr>
         <w:tc>
           <w:tcPr>
-            <w:tcW w:type="dxa" w:w="2880"/>
+            <w:tcW w:type="dxa" w:w="3360"/>
+            <w:shd w:val="clear" w:color="auto" w:fill="D3DFEE"/>
           </w:tcPr>
           <w:p>
+            <w:pPr>
+              <w:spacing w:before="40" w:after="40" w:line="240" w:lineRule="auto"/>
+            </w:pPr>
+            <w:r/>
             <w:r>
+              <w:rPr>
+                <w:b/>
+                <w:color w:val="173A53"/>
+                <w:sz w:val="20"/>
+              </w:rPr>
               <w:t>Card metadata / structured data</w:t>
             </w:r>
           </w:p>
         </w:tc>
         <w:tc>
           <w:tcPr>
-            <w:tcW w:type="dxa" w:w="2880"/>
+            <w:tcW w:type="dxa" w:w="3360"/>
+            <w:shd w:val="clear" w:color="auto" w:fill="D3DFEE"/>
           </w:tcPr>
           <w:p>
+            <w:pPr>
+              <w:spacing w:before="40" w:after="40" w:line="240" w:lineRule="auto"/>
+            </w:pPr>
+            <w:r/>
             <w:r>
+              <w:rPr>
+                <w:color w:val="1A1A1A"/>
+                <w:sz w:val="20"/>
+              </w:rPr>
               <w:t>Postgres (CNPG/database)</w:t>
             </w:r>
           </w:p>
         </w:tc>
         <w:tc>
           <w:tcPr>
-            <w:tcW w:type="dxa" w:w="2880"/>
+            <w:tcW w:type="dxa" w:w="3360"/>
+            <w:shd w:val="clear" w:color="auto" w:fill="D3DFEE"/>
           </w:tcPr>
           <w:p>
+            <w:pPr>
+              <w:spacing w:before="40" w:after="40" w:line="240" w:lineRule="auto"/>
+            </w:pPr>
+            <w:r/>
             <w:r>
+              <w:rPr>
+                <w:color w:val="1A1A1A"/>
+                <w:sz w:val="20"/>
+              </w:rPr>
               <w:t>Existing pattern</w:t>
             </w:r>
           </w:p>
         </w:tc>
       </w:tr>
       <w:tr>
+        <w:trPr>
+          <w:cantSplit/>
+        </w:trPr>
         <w:tc>
           <w:tcPr>
-            <w:tcW w:type="dxa" w:w="2880"/>
+            <w:tcW w:type="dxa" w:w="3360"/>
+            <w:shd w:val="clear" w:color="auto" w:fill="FFFFFF"/>
           </w:tcPr>
           <w:p>
+            <w:pPr>
+              <w:spacing w:before="40" w:after="40" w:line="240" w:lineRule="auto"/>
+            </w:pPr>
+            <w:r/>
             <w:r>
+              <w:rPr>
+                <w:b/>
+                <w:color w:val="173A53"/>
+                <w:sz w:val="20"/>
+              </w:rPr>
               <w:t>Existing media/app bulk</w:t>
             </w:r>
           </w:p>
         </w:tc>
         <w:tc>
           <w:tcPr>
-            <w:tcW w:type="dxa" w:w="2880"/>
+            <w:tcW w:type="dxa" w:w="3360"/>
+            <w:shd w:val="clear" w:color="auto" w:fill="FFFFFF"/>
           </w:tcPr>
           <w:p>
+            <w:pPr>
+              <w:spacing w:before="40" w:after="40" w:line="240" w:lineRule="auto"/>
+            </w:pPr>
+            <w:r/>
             <w:r>
+              <w:rPr>
+                <w:color w:val="1A1A1A"/>
+                <w:sz w:val="20"/>
+              </w:rPr>
               <w:t>//192.168.68.70/PVC (mini SMB)</w:t>
             </w:r>
           </w:p>
         </w:tc>
         <w:tc>
           <w:tcPr>
-            <w:tcW w:type="dxa" w:w="2880"/>
+            <w:tcW w:type="dxa" w:w="3360"/>
+            <w:shd w:val="clear" w:color="auto" w:fill="FFFFFF"/>
           </w:tcPr>
           <w:p>
+            <w:pPr>
+              <w:spacing w:before="40" w:after="40" w:line="240" w:lineRule="auto"/>
+            </w:pPr>
+            <w:r/>
             <w:r>
+              <w:rPr>
+                <w:color w:val="1A1A1A"/>
+                <w:sz w:val="20"/>
+              </w:rPr>
               <w:t>Keep as-is</w:t>
             </w:r>
           </w:p>
         </w:tc>
       </w:tr>
     </w:tbl>
-    <w:p/>
+    <w:p>
+      <w:pPr>
+        <w:spacing w:after="40" w:line="120" w:lineRule="exact"/>
+      </w:pPr>
+    </w:p>
     <w:p>
       <w:pPr>
         <w:pStyle w:val="Heading1"/>
@@ -692,10 +1177,17 @@
       </w:r>
     </w:p>
     <w:p>
+      <w:pPr>
+        <w:keepLines/>
+        <w:spacing w:line="240" w:lineRule="auto" w:before="40" w:after="180"/>
+        <w:ind w:left="86" w:right="86"/>
+        <w:shd w:val="clear" w:color="auto" w:fill="F0F4F7"/>
+      </w:pPr>
       <w:r>
         <w:rPr>
-          <w:rFonts w:ascii="Consolas" w:hAnsi="Consolas"/>
-          <w:sz w:val="18"/>
+          <w:rFonts w:ascii="Consolas" w:hAnsi="Consolas" w:eastAsia="Consolas"/>
+          <w:color w:val="000000"/>
+          <w:sz w:val="19"/>
         </w:rPr>
         <w:t>kubectl -n devpod get ns,resourcequota,limitrange,pvc</w:t>
         <w:br/>
@@ -717,23 +1209,48 @@
     </w:p>
     <w:tbl>
       <w:tblPr>
-        <w:tblStyle w:val="TableGrid"/>
+        <w:tblStyle w:val="LightShading-Accent1"/>
         <w:tblW w:type="auto" w:w="0"/>
+        <w:tblLayout w:type="fixed"/>
         <w:tblLook w:firstColumn="1" w:firstRow="1" w:lastColumn="0" w:lastRow="0" w:noHBand="0" w:noVBand="1" w:val="04A0"/>
+        <w:tblBorders>
+          <w:top w:val="single" w:sz="8" w:space="0" w:color="4F81BD"/>
+          <w:left w:val="nil"/>
+          <w:bottom w:val="single" w:sz="8" w:space="0" w:color="4F81BD"/>
+          <w:right w:val="nil"/>
+          <w:insideH w:val="nil"/>
+          <w:insideV w:val="nil"/>
+        </w:tblBorders>
       </w:tblPr>
       <w:tblGrid>
-        <w:gridCol w:w="4320"/>
-        <w:gridCol w:w="4320"/>
+        <w:gridCol w:w="5040"/>
+        <w:gridCol w:w="5040"/>
       </w:tblGrid>
       <w:tr>
+        <w:trPr>
+          <w:cantSplit/>
+          <w:tblHeader w:val="true"/>
+        </w:trPr>
         <w:tc>
           <w:tcPr>
-            <w:tcW w:type="dxa" w:w="4320"/>
+            <w:tcW w:type="dxa" w:w="5040"/>
+            <w:tcBorders>
+              <w:top w:val="single" w:sz="8" w:space="0" w:color="4F81BD"/>
+              <w:bottom w:val="single" w:sz="8" w:space="0" w:color="4F81BD"/>
+            </w:tcBorders>
+            <w:shd w:val="clear" w:color="auto" w:fill="365F91"/>
           </w:tcPr>
           <w:p>
+            <w:pPr>
+              <w:keepNext/>
+              <w:spacing w:before="40" w:after="40" w:line="240" w:lineRule="auto"/>
+            </w:pPr>
+            <w:r/>
             <w:r>
               <w:rPr>
                 <w:b/>
+                <w:color w:val="FFFFFF"/>
+                <w:sz w:val="20"/>
               </w:rPr>
               <w:t>Option</w:t>
             </w:r>
@@ -741,12 +1258,24 @@
         </w:tc>
         <w:tc>
           <w:tcPr>
-            <w:tcW w:type="dxa" w:w="4320"/>
+            <w:tcW w:type="dxa" w:w="5040"/>
+            <w:tcBorders>
+              <w:top w:val="single" w:sz="8" w:space="0" w:color="4F81BD"/>
+              <w:bottom w:val="single" w:sz="8" w:space="0" w:color="4F81BD"/>
+            </w:tcBorders>
+            <w:shd w:val="clear" w:color="auto" w:fill="365F91"/>
           </w:tcPr>
           <w:p>
+            <w:pPr>
+              <w:keepNext/>
+              <w:spacing w:before="40" w:after="40" w:line="240" w:lineRule="auto"/>
+            </w:pPr>
+            <w:r/>
             <w:r>
               <w:rPr>
                 <w:b/>
+                <w:color w:val="FFFFFF"/>
+                <w:sz w:val="20"/>
               </w:rPr>
               <w:t>Value</w:t>
             </w:r>
@@ -754,237 +1283,468 @@
         </w:tc>
       </w:tr>
       <w:tr>
+        <w:trPr>
+          <w:cantSplit/>
+        </w:trPr>
         <w:tc>
           <w:tcPr>
-            <w:tcW w:type="dxa" w:w="4320"/>
+            <w:tcW w:type="dxa" w:w="5040"/>
+            <w:shd w:val="clear" w:color="auto" w:fill="D3DFEE"/>
           </w:tcPr>
           <w:p>
+            <w:pPr>
+              <w:spacing w:before="40" w:after="40" w:line="240" w:lineRule="auto"/>
+            </w:pPr>
+            <w:r/>
             <w:r>
+              <w:rPr>
+                <w:b/>
+                <w:color w:val="173A53"/>
+                <w:sz w:val="20"/>
+              </w:rPr>
               <w:t>KUBERNETES_NAMESPACE</w:t>
             </w:r>
           </w:p>
         </w:tc>
         <w:tc>
           <w:tcPr>
-            <w:tcW w:type="dxa" w:w="4320"/>
+            <w:tcW w:type="dxa" w:w="5040"/>
+            <w:shd w:val="clear" w:color="auto" w:fill="D3DFEE"/>
           </w:tcPr>
           <w:p>
+            <w:pPr>
+              <w:spacing w:before="40" w:after="40" w:line="240" w:lineRule="auto"/>
+            </w:pPr>
+            <w:r/>
             <w:r>
+              <w:rPr>
+                <w:color w:val="1A1A1A"/>
+                <w:sz w:val="20"/>
+              </w:rPr>
               <w:t>devpod</w:t>
             </w:r>
           </w:p>
         </w:tc>
       </w:tr>
       <w:tr>
+        <w:trPr>
+          <w:cantSplit/>
+        </w:trPr>
         <w:tc>
           <w:tcPr>
-            <w:tcW w:type="dxa" w:w="4320"/>
+            <w:tcW w:type="dxa" w:w="5040"/>
+            <w:shd w:val="clear" w:color="auto" w:fill="FFFFFF"/>
           </w:tcPr>
           <w:p>
+            <w:pPr>
+              <w:spacing w:before="40" w:after="40" w:line="240" w:lineRule="auto"/>
+            </w:pPr>
+            <w:r/>
             <w:r>
+              <w:rPr>
+                <w:b/>
+                <w:color w:val="173A53"/>
+                <w:sz w:val="20"/>
+              </w:rPr>
               <w:t>CREATE_NAMESPACE</w:t>
             </w:r>
           </w:p>
         </w:tc>
         <w:tc>
           <w:tcPr>
-            <w:tcW w:type="dxa" w:w="4320"/>
+            <w:tcW w:type="dxa" w:w="5040"/>
+            <w:shd w:val="clear" w:color="auto" w:fill="FFFFFF"/>
           </w:tcPr>
           <w:p>
+            <w:pPr>
+              <w:spacing w:before="40" w:after="40" w:line="240" w:lineRule="auto"/>
+            </w:pPr>
+            <w:r/>
             <w:r>
+              <w:rPr>
+                <w:color w:val="1A1A1A"/>
+                <w:sz w:val="20"/>
+              </w:rPr>
               <w:t>false</w:t>
             </w:r>
           </w:p>
         </w:tc>
       </w:tr>
       <w:tr>
+        <w:trPr>
+          <w:cantSplit/>
+        </w:trPr>
         <w:tc>
           <w:tcPr>
-            <w:tcW w:type="dxa" w:w="4320"/>
+            <w:tcW w:type="dxa" w:w="5040"/>
+            <w:shd w:val="clear" w:color="auto" w:fill="D3DFEE"/>
           </w:tcPr>
           <w:p>
+            <w:pPr>
+              <w:spacing w:before="40" w:after="40" w:line="240" w:lineRule="auto"/>
+            </w:pPr>
+            <w:r/>
             <w:r>
+              <w:rPr>
+                <w:b/>
+                <w:color w:val="173A53"/>
+                <w:sz w:val="20"/>
+              </w:rPr>
               <w:t>KUBERNETES_CONTEXT</w:t>
             </w:r>
           </w:p>
         </w:tc>
         <w:tc>
           <w:tcPr>
-            <w:tcW w:type="dxa" w:w="4320"/>
+            <w:tcW w:type="dxa" w:w="5040"/>
+            <w:shd w:val="clear" w:color="auto" w:fill="D3DFEE"/>
           </w:tcPr>
           <w:p>
+            <w:pPr>
+              <w:spacing w:before="40" w:after="40" w:line="240" w:lineRule="auto"/>
+            </w:pPr>
+            <w:r/>
             <w:r>
+              <w:rPr>
+                <w:color w:val="1A1A1A"/>
+                <w:sz w:val="20"/>
+              </w:rPr>
               <w:t>default</w:t>
             </w:r>
           </w:p>
         </w:tc>
       </w:tr>
       <w:tr>
+        <w:trPr>
+          <w:cantSplit/>
+        </w:trPr>
         <w:tc>
           <w:tcPr>
-            <w:tcW w:type="dxa" w:w="4320"/>
+            <w:tcW w:type="dxa" w:w="5040"/>
+            <w:shd w:val="clear" w:color="auto" w:fill="FFFFFF"/>
           </w:tcPr>
           <w:p>
+            <w:pPr>
+              <w:spacing w:before="40" w:after="40" w:line="240" w:lineRule="auto"/>
+            </w:pPr>
+            <w:r/>
             <w:r>
+              <w:rPr>
+                <w:b/>
+                <w:color w:val="173A53"/>
+                <w:sz w:val="20"/>
+              </w:rPr>
               <w:t>STORAGE_CLASS</w:t>
             </w:r>
           </w:p>
         </w:tc>
         <w:tc>
           <w:tcPr>
-            <w:tcW w:type="dxa" w:w="4320"/>
+            <w:tcW w:type="dxa" w:w="5040"/>
+            <w:shd w:val="clear" w:color="auto" w:fill="FFFFFF"/>
           </w:tcPr>
           <w:p>
+            <w:pPr>
+              <w:spacing w:before="40" w:after="40" w:line="240" w:lineRule="auto"/>
+            </w:pPr>
+            <w:r/>
             <w:r>
+              <w:rPr>
+                <w:color w:val="1A1A1A"/>
+                <w:sz w:val="20"/>
+              </w:rPr>
               <w:t>longhorn</w:t>
             </w:r>
           </w:p>
         </w:tc>
       </w:tr>
       <w:tr>
+        <w:trPr>
+          <w:cantSplit/>
+        </w:trPr>
         <w:tc>
           <w:tcPr>
-            <w:tcW w:type="dxa" w:w="4320"/>
+            <w:tcW w:type="dxa" w:w="5040"/>
+            <w:shd w:val="clear" w:color="auto" w:fill="D3DFEE"/>
           </w:tcPr>
           <w:p>
+            <w:pPr>
+              <w:spacing w:before="40" w:after="40" w:line="240" w:lineRule="auto"/>
+            </w:pPr>
+            <w:r/>
             <w:r>
+              <w:rPr>
+                <w:b/>
+                <w:color w:val="173A53"/>
+                <w:sz w:val="20"/>
+              </w:rPr>
               <w:t>DISK_SIZE</w:t>
             </w:r>
           </w:p>
         </w:tc>
         <w:tc>
           <w:tcPr>
-            <w:tcW w:type="dxa" w:w="4320"/>
+            <w:tcW w:type="dxa" w:w="5040"/>
+            <w:shd w:val="clear" w:color="auto" w:fill="D3DFEE"/>
           </w:tcPr>
           <w:p>
+            <w:pPr>
+              <w:spacing w:before="40" w:after="40" w:line="240" w:lineRule="auto"/>
+            </w:pPr>
+            <w:r/>
             <w:r>
+              <w:rPr>
+                <w:color w:val="1A1A1A"/>
+                <w:sz w:val="20"/>
+              </w:rPr>
               <w:t>40Gi</w:t>
             </w:r>
           </w:p>
         </w:tc>
       </w:tr>
       <w:tr>
+        <w:trPr>
+          <w:cantSplit/>
+        </w:trPr>
         <w:tc>
           <w:tcPr>
-            <w:tcW w:type="dxa" w:w="4320"/>
+            <w:tcW w:type="dxa" w:w="5040"/>
+            <w:shd w:val="clear" w:color="auto" w:fill="FFFFFF"/>
           </w:tcPr>
           <w:p>
+            <w:pPr>
+              <w:spacing w:before="40" w:after="40" w:line="240" w:lineRule="auto"/>
+            </w:pPr>
+            <w:r/>
             <w:r>
+              <w:rPr>
+                <w:b/>
+                <w:color w:val="173A53"/>
+                <w:sz w:val="20"/>
+              </w:rPr>
               <w:t>PVC_ACCESS_MODE</w:t>
             </w:r>
           </w:p>
         </w:tc>
         <w:tc>
           <w:tcPr>
-            <w:tcW w:type="dxa" w:w="4320"/>
+            <w:tcW w:type="dxa" w:w="5040"/>
+            <w:shd w:val="clear" w:color="auto" w:fill="FFFFFF"/>
           </w:tcPr>
           <w:p>
+            <w:pPr>
+              <w:spacing w:before="40" w:after="40" w:line="240" w:lineRule="auto"/>
+            </w:pPr>
+            <w:r/>
             <w:r>
+              <w:rPr>
+                <w:color w:val="1A1A1A"/>
+                <w:sz w:val="20"/>
+              </w:rPr>
               <w:t>RWO</w:t>
             </w:r>
           </w:p>
         </w:tc>
       </w:tr>
       <w:tr>
+        <w:trPr>
+          <w:cantSplit/>
+        </w:trPr>
         <w:tc>
           <w:tcPr>
-            <w:tcW w:type="dxa" w:w="4320"/>
+            <w:tcW w:type="dxa" w:w="5040"/>
+            <w:shd w:val="clear" w:color="auto" w:fill="D3DFEE"/>
           </w:tcPr>
           <w:p>
+            <w:pPr>
+              <w:spacing w:before="40" w:after="40" w:line="240" w:lineRule="auto"/>
+            </w:pPr>
+            <w:r/>
             <w:r>
+              <w:rPr>
+                <w:b/>
+                <w:color w:val="173A53"/>
+                <w:sz w:val="20"/>
+              </w:rPr>
               <w:t>ARCHITECTURE</w:t>
             </w:r>
           </w:p>
         </w:tc>
         <w:tc>
           <w:tcPr>
-            <w:tcW w:type="dxa" w:w="4320"/>
+            <w:tcW w:type="dxa" w:w="5040"/>
+            <w:shd w:val="clear" w:color="auto" w:fill="D3DFEE"/>
           </w:tcPr>
           <w:p>
+            <w:pPr>
+              <w:spacing w:before="40" w:after="40" w:line="240" w:lineRule="auto"/>
+            </w:pPr>
+            <w:r/>
             <w:r>
+              <w:rPr>
+                <w:color w:val="1A1A1A"/>
+                <w:sz w:val="20"/>
+              </w:rPr>
               <w:t>amd64</w:t>
             </w:r>
           </w:p>
         </w:tc>
       </w:tr>
       <w:tr>
+        <w:trPr>
+          <w:cantSplit/>
+        </w:trPr>
         <w:tc>
           <w:tcPr>
-            <w:tcW w:type="dxa" w:w="4320"/>
+            <w:tcW w:type="dxa" w:w="5040"/>
+            <w:shd w:val="clear" w:color="auto" w:fill="FFFFFF"/>
           </w:tcPr>
           <w:p>
+            <w:pPr>
+              <w:spacing w:before="40" w:after="40" w:line="240" w:lineRule="auto"/>
+            </w:pPr>
+            <w:r/>
             <w:r>
+              <w:rPr>
+                <w:b/>
+                <w:color w:val="173A53"/>
+                <w:sz w:val="20"/>
+              </w:rPr>
               <w:t>RESOURCES</w:t>
             </w:r>
           </w:p>
         </w:tc>
         <w:tc>
           <w:tcPr>
-            <w:tcW w:type="dxa" w:w="4320"/>
+            <w:tcW w:type="dxa" w:w="5040"/>
+            <w:shd w:val="clear" w:color="auto" w:fill="FFFFFF"/>
           </w:tcPr>
           <w:p>
+            <w:pPr>
+              <w:spacing w:before="40" w:after="40" w:line="240" w:lineRule="auto"/>
+            </w:pPr>
+            <w:r/>
             <w:r>
+              <w:rPr>
+                <w:color w:val="1A1A1A"/>
+                <w:sz w:val="20"/>
+              </w:rPr>
               <w:t>requests.cpu=500m,requests.memory=1Gi,limits.cpu=2,limits.memory=4Gi</w:t>
             </w:r>
           </w:p>
         </w:tc>
       </w:tr>
       <w:tr>
+        <w:trPr>
+          <w:cantSplit/>
+        </w:trPr>
         <w:tc>
           <w:tcPr>
-            <w:tcW w:type="dxa" w:w="4320"/>
+            <w:tcW w:type="dxa" w:w="5040"/>
+            <w:shd w:val="clear" w:color="auto" w:fill="D3DFEE"/>
           </w:tcPr>
           <w:p>
+            <w:pPr>
+              <w:spacing w:before="40" w:after="40" w:line="240" w:lineRule="auto"/>
+            </w:pPr>
+            <w:r/>
             <w:r>
+              <w:rPr>
+                <w:b/>
+                <w:color w:val="173A53"/>
+                <w:sz w:val="20"/>
+              </w:rPr>
               <w:t>POD_MANIFEST_TEMPLATE</w:t>
             </w:r>
           </w:p>
         </w:tc>
         <w:tc>
           <w:tcPr>
-            <w:tcW w:type="dxa" w:w="4320"/>
+            <w:tcW w:type="dxa" w:w="5040"/>
+            <w:shd w:val="clear" w:color="auto" w:fill="D3DFEE"/>
           </w:tcPr>
           <w:p>
+            <w:pPr>
+              <w:spacing w:before="40" w:after="40" w:line="240" w:lineRule="auto"/>
+            </w:pPr>
+            <w:r/>
             <w:r>
+              <w:rPr>
+                <w:color w:val="1A1A1A"/>
+                <w:sz w:val="20"/>
+              </w:rPr>
               <w:t>/Users/cyberstar/.config/devpod/skynet-pod-template.yaml</w:t>
             </w:r>
           </w:p>
         </w:tc>
       </w:tr>
       <w:tr>
+        <w:trPr>
+          <w:cantSplit/>
+        </w:trPr>
         <w:tc>
           <w:tcPr>
-            <w:tcW w:type="dxa" w:w="4320"/>
+            <w:tcW w:type="dxa" w:w="5040"/>
+            <w:shd w:val="clear" w:color="auto" w:fill="FFFFFF"/>
           </w:tcPr>
           <w:p>
+            <w:pPr>
+              <w:spacing w:before="40" w:after="40" w:line="240" w:lineRule="auto"/>
+            </w:pPr>
+            <w:r/>
             <w:r>
+              <w:rPr>
+                <w:b/>
+                <w:color w:val="173A53"/>
+                <w:sz w:val="20"/>
+              </w:rPr>
               <w:t>NODE_SELECTOR</w:t>
             </w:r>
           </w:p>
         </w:tc>
         <w:tc>
           <w:tcPr>
-            <w:tcW w:type="dxa" w:w="4320"/>
+            <w:tcW w:type="dxa" w:w="5040"/>
+            <w:shd w:val="clear" w:color="auto" w:fill="FFFFFF"/>
           </w:tcPr>
           <w:p>
+            <w:pPr>
+              <w:spacing w:before="40" w:after="40" w:line="240" w:lineRule="auto"/>
+            </w:pPr>
+            <w:r/>
             <w:r>
+              <w:rPr>
+                <w:color w:val="1A1A1A"/>
+                <w:sz w:val="20"/>
+              </w:rPr>
               <w:t>(empty — unpinned)</w:t>
             </w:r>
           </w:p>
         </w:tc>
       </w:tr>
     </w:tbl>
-    <w:p/>
+    <w:p>
+      <w:pPr>
+        <w:spacing w:after="40" w:line="120" w:lineRule="exact"/>
+      </w:pPr>
+    </w:p>
     <w:p>
       <w:r>
         <w:t>Pod template (scratch mount):</w:t>
       </w:r>
     </w:p>
     <w:p>
+      <w:pPr>
+        <w:keepLines/>
+        <w:spacing w:line="240" w:lineRule="auto" w:before="40" w:after="180"/>
+        <w:ind w:left="86" w:right="86"/>
+        <w:shd w:val="clear" w:color="auto" w:fill="F0F4F7"/>
+      </w:pPr>
       <w:r>
         <w:rPr>
-          <w:rFonts w:ascii="Consolas" w:hAnsi="Consolas"/>
-          <w:sz w:val="18"/>
+          <w:rFonts w:ascii="Consolas" w:hAnsi="Consolas" w:eastAsia="Consolas"/>
+          <w:color w:val="000000"/>
+          <w:sz w:val="19"/>
         </w:rPr>
         <w:t>apiVersion: v1</w:t>
         <w:br/>
@@ -1033,10 +1793,17 @@
       </w:r>
     </w:p>
     <w:p>
+      <w:pPr>
+        <w:keepLines/>
+        <w:spacing w:line="240" w:lineRule="auto" w:before="40" w:after="180"/>
+        <w:ind w:left="86" w:right="86"/>
+        <w:shd w:val="clear" w:color="auto" w:fill="F0F4F7"/>
+      </w:pPr>
       <w:r>
         <w:rPr>
-          <w:rFonts w:ascii="Consolas" w:hAnsi="Consolas"/>
-          <w:sz w:val="18"/>
+          <w:rFonts w:ascii="Consolas" w:hAnsi="Consolas" w:eastAsia="Consolas"/>
+          <w:color w:val="000000"/>
+          <w:sz w:val="19"/>
         </w:rPr>
         <w:t># from M5</w:t>
         <w:br/>
@@ -1063,10 +1830,17 @@
       </w:r>
     </w:p>
     <w:p>
+      <w:pPr>
+        <w:keepLines/>
+        <w:spacing w:line="240" w:lineRule="auto" w:before="40" w:after="180"/>
+        <w:ind w:left="86" w:right="86"/>
+        <w:shd w:val="clear" w:color="auto" w:fill="F0F4F7"/>
+      </w:pPr>
       <w:r>
         <w:rPr>
-          <w:rFonts w:ascii="Consolas" w:hAnsi="Consolas"/>
-          <w:sz w:val="18"/>
+          <w:rFonts w:ascii="Consolas" w:hAnsi="Consolas" w:eastAsia="Consolas"/>
+          <w:color w:val="000000"/>
+          <w:sz w:val="19"/>
         </w:rPr>
         <w:t>devpod ssh cluster-dashboard</w:t>
         <w:br/>
@@ -1093,10 +1867,17 @@
       </w:r>
     </w:p>
     <w:p>
+      <w:pPr>
+        <w:keepLines/>
+        <w:spacing w:line="240" w:lineRule="auto" w:before="40" w:after="180"/>
+        <w:ind w:left="86" w:right="86"/>
+        <w:shd w:val="clear" w:color="auto" w:fill="F0F4F7"/>
+      </w:pPr>
       <w:r>
         <w:rPr>
-          <w:rFonts w:ascii="Consolas" w:hAnsi="Consolas"/>
-          <w:sz w:val="18"/>
+          <w:rFonts w:ascii="Consolas" w:hAnsi="Consolas" w:eastAsia="Consolas"/>
+          <w:color w:val="000000"/>
+          <w:sz w:val="19"/>
         </w:rPr>
         <w:t>devpod list</w:t>
         <w:br/>
@@ -1297,13 +2078,93 @@
       </w:r>
     </w:p>
     <w:sectPr>
+      <w:headerReference w:type="default" r:id="rId9"/>
+      <w:footerReference w:type="default" r:id="rId10"/>
       <w:pgSz w:w="12240" w:h="15840"/>
-      <w:pgMar w:top="1440" w:right="1800" w:bottom="1440" w:left="1800" w:header="720" w:footer="720" w:gutter="0"/>
+      <w:pgMar w:top="1008" w:right="1080" w:bottom="1008" w:left="1080" w:header="720" w:footer="720" w:gutter="0"/>
       <w:cols w:space="720"/>
       <w:docGrid w:linePitch="360"/>
     </w:sectPr>
   </w:body>
 </w:document>
+</file>
+
+<file path=word/footer1.xml><?xml version="1.0" encoding="utf-8"?>
+<w:ftr xmlns:m="http://schemas.openxmlformats.org/officeDocument/2006/math" xmlns:mc="http://schemas.openxmlformats.org/markup-compatibility/2006" xmlns:mo="http://schemas.microsoft.com/office/mac/office/2008/main" xmlns:mv="urn:schemas-microsoft-com:mac:vml" xmlns:o="urn:schemas-microsoft-com:office:office" xmlns:r="http://schemas.openxmlformats.org/officeDocument/2006/relationships" xmlns:v="urn:schemas-microsoft-com:vml" xmlns:w10="urn:schemas-microsoft-com:office:word" xmlns:w14="http://schemas.microsoft.com/office/word/2010/wordml" xmlns:w="http://schemas.openxmlformats.org/wordprocessingml/2006/main" xmlns:wne="http://schemas.microsoft.com/office/word/2006/wordml" xmlns:wp14="http://schemas.microsoft.com/office/word/2010/wordprocessingDrawing" xmlns:wp="http://schemas.openxmlformats.org/drawingml/2006/wordprocessingDrawing" xmlns:wpc="http://schemas.microsoft.com/office/word/2010/wordprocessingCanvas" xmlns:wpg="http://schemas.microsoft.com/office/word/2010/wordprocessingGroup" xmlns:wpi="http://schemas.microsoft.com/office/word/2010/wordprocessingInk" xmlns:wps="http://schemas.microsoft.com/office/word/2010/wordprocessingShape" mc:Ignorable="w14 wp14">
+  <w:p>
+    <w:pPr>
+      <w:pStyle w:val="Footer"/>
+      <w:tabs>
+        <w:tab w:pos="4680" w:val="clear"/>
+        <w:tab w:pos="9360" w:val="clear"/>
+        <w:tab w:pos="10080" w:val="right"/>
+      </w:tabs>
+    </w:pPr>
+    <w:r/>
+    <w:r>
+      <w:rPr>
+        <w:color w:val="595959"/>
+        <w:sz w:val="18"/>
+      </w:rPr>
+      <w:t>Homelab DevPod on Skynet Runbook</w:t>
+      <w:tab/>
+    </w:r>
+    <w:r>
+      <w:rPr>
+        <w:color w:val="595959"/>
+        <w:sz w:val="18"/>
+      </w:rPr>
+      <w:fldChar w:fldCharType="begin"/>
+    </w:r>
+    <w:r>
+      <w:rPr>
+        <w:color w:val="595959"/>
+        <w:sz w:val="18"/>
+      </w:rPr>
+      <w:instrText xml:space="preserve">PAGE</w:instrText>
+    </w:r>
+    <w:r>
+      <w:rPr>
+        <w:color w:val="595959"/>
+        <w:sz w:val="18"/>
+      </w:rPr>
+      <w:fldChar w:fldCharType="separate"/>
+    </w:r>
+    <w:r>
+      <w:rPr>
+        <w:color w:val="595959"/>
+        <w:sz w:val="18"/>
+      </w:rPr>
+      <w:t>1</w:t>
+    </w:r>
+    <w:r>
+      <w:rPr>
+        <w:color w:val="595959"/>
+        <w:sz w:val="18"/>
+      </w:rPr>
+      <w:fldChar w:fldCharType="end"/>
+    </w:r>
+  </w:p>
+</w:ftr>
+</file>
+
+<file path=word/header1.xml><?xml version="1.0" encoding="utf-8"?>
+<w:hdr xmlns:m="http://schemas.openxmlformats.org/officeDocument/2006/math" xmlns:mc="http://schemas.openxmlformats.org/markup-compatibility/2006" xmlns:mo="http://schemas.microsoft.com/office/mac/office/2008/main" xmlns:mv="urn:schemas-microsoft-com:mac:vml" xmlns:o="urn:schemas-microsoft-com:office:office" xmlns:r="http://schemas.openxmlformats.org/officeDocument/2006/relationships" xmlns:v="urn:schemas-microsoft-com:vml" xmlns:w10="urn:schemas-microsoft-com:office:word" xmlns:w14="http://schemas.microsoft.com/office/word/2010/wordml" xmlns:w="http://schemas.openxmlformats.org/wordprocessingml/2006/main" xmlns:wne="http://schemas.microsoft.com/office/word/2006/wordml" xmlns:wp14="http://schemas.microsoft.com/office/word/2010/wordprocessingDrawing" xmlns:wp="http://schemas.openxmlformats.org/drawingml/2006/wordprocessingDrawing" xmlns:wpc="http://schemas.microsoft.com/office/word/2010/wordprocessingCanvas" xmlns:wpg="http://schemas.microsoft.com/office/word/2010/wordprocessingGroup" xmlns:wpi="http://schemas.microsoft.com/office/word/2010/wordprocessingInk" xmlns:wps="http://schemas.microsoft.com/office/word/2010/wordprocessingShape" mc:Ignorable="w14 wp14">
+  <w:p>
+    <w:pPr>
+      <w:pStyle w:val="Header"/>
+    </w:pPr>
+    <w:r/>
+    <w:r>
+      <w:rPr>
+        <w:b/>
+        <w:color w:val="4F81BD"/>
+        <w:sz w:val="18"/>
+      </w:rPr>
+      <w:t>SKYNET HOME LAB   /   DEVPOD RUNBOOK</w:t>
+    </w:r>
+  </w:p>
+</w:hdr>
 </file>
 
 <file path=word/numbering.xml><?xml version="1.0" encoding="utf-8"?>
@@ -1669,8 +2530,11 @@
     <w:name w:val="Normal"/>
     <w:qFormat/>
     <w:rsid w:val="00FC693F"/>
+    <w:pPr>
+      <w:spacing w:after="140" w:line="276" w:lineRule="auto"/>
+    </w:pPr>
     <w:rPr>
-      <w:rFonts w:ascii="Calibri" w:hAnsi="Calibri"/>
+      <w:rFonts w:ascii="Calibri" w:hAnsi="Calibri" w:eastAsia="Calibri"/>
       <w:sz w:val="22"/>
     </w:rPr>
   </w:style>
@@ -1729,14 +2593,18 @@
     <w:pPr>
       <w:keepNext/>
       <w:keepLines/>
-      <w:spacing w:before="480" w:after="0"/>
+      <w:pBdr>
+        <w:bottom w:val="single" w:sz="6" w:space="2" w:color="4F81BD"/>
+      </w:pBdr>
+      <w:spacing w:before="320" w:after="120"/>
       <w:outlineLvl w:val="0"/>
     </w:pPr>
     <w:rPr>
-      <w:rFonts w:asciiTheme="majorHAnsi" w:eastAsiaTheme="majorEastAsia" w:hAnsiTheme="majorHAnsi" w:cstheme="majorBidi" w:ascii="Calibri" w:hAnsi="Calibri"/>
+      <w:rFonts w:ascii="Calibri" w:hAnsi="Calibri"/>
       <w:b/>
       <w:bCs/>
-      <w:sz w:val="28"/>
+      <w:color w:val="173A53"/>
+      <w:sz w:val="32"/>
       <w:szCs w:val="28"/>
     </w:rPr>
   </w:style>
@@ -1752,13 +2620,14 @@
     <w:pPr>
       <w:keepNext/>
       <w:keepLines/>
-      <w:spacing w:before="200" w:after="0"/>
+      <w:spacing w:before="240" w:after="60"/>
       <w:outlineLvl w:val="1"/>
     </w:pPr>
     <w:rPr>
-      <w:rFonts w:asciiTheme="majorHAnsi" w:eastAsiaTheme="majorEastAsia" w:hAnsiTheme="majorHAnsi" w:cstheme="majorBidi" w:ascii="Calibri" w:hAnsi="Calibri"/>
+      <w:rFonts w:ascii="Calibri" w:hAnsi="Calibri"/>
       <w:b/>
       <w:bCs/>
+      <w:color w:val="173A53"/>
       <w:sz w:val="26"/>
       <w:szCs w:val="26"/>
     </w:rPr>
@@ -1775,13 +2644,15 @@
     <w:pPr>
       <w:keepNext/>
       <w:keepLines/>
-      <w:spacing w:before="200" w:after="0"/>
+      <w:spacing w:before="200" w:after="40"/>
       <w:outlineLvl w:val="2"/>
     </w:pPr>
     <w:rPr>
-      <w:rFonts w:asciiTheme="majorHAnsi" w:eastAsiaTheme="majorEastAsia" w:hAnsiTheme="majorHAnsi" w:cstheme="majorBidi" w:ascii="Calibri" w:hAnsi="Calibri"/>
+      <w:rFonts w:ascii="Calibri" w:hAnsi="Calibri"/>
       <w:b/>
       <w:bCs/>
+      <w:color w:val="4F81BD"/>
+      <w:sz w:val="22"/>
     </w:rPr>
   </w:style>
   <w:style w:type="paragraph" w:styleId="Heading4">
@@ -2015,12 +2886,12 @@
       <w:pBdr>
         <w:bottom w:val="single" w:sz="8" w:space="4" w:color="4F81BD" w:themeColor="accent1"/>
       </w:pBdr>
-      <w:spacing w:after="300" w:line="240" w:lineRule="auto"/>
+      <w:spacing w:after="240" w:line="240" w:lineRule="auto"/>
       <w:contextualSpacing/>
     </w:pPr>
     <w:rPr>
-      <w:rFonts w:asciiTheme="majorHAnsi" w:eastAsiaTheme="majorEastAsia" w:hAnsiTheme="majorHAnsi" w:cstheme="majorBidi"/>
-      <w:color w:val="17365D" w:themeColor="text2" w:themeShade="BF"/>
+      <w:rFonts w:ascii="Calibri" w:hAnsi="Calibri"/>
+      <w:color w:val="173A53"/>
       <w:spacing w:val="5"/>
       <w:kern w:val="28"/>
       <w:sz w:val="52"/>
@@ -2050,16 +2921,12 @@
     <w:uiPriority w:val="11"/>
     <w:qFormat/>
     <w:rsid w:val="00FC693F"/>
-    <w:pPr>
-      <w:numPr>
-        <w:ilvl w:val="1"/>
-      </w:numPr>
-    </w:pPr>
+    <w:pPr/>
     <w:rPr>
-      <w:rFonts w:asciiTheme="majorHAnsi" w:eastAsiaTheme="majorEastAsia" w:hAnsiTheme="majorHAnsi" w:cstheme="majorBidi"/>
+      <w:rFonts w:ascii="Calibri" w:hAnsi="Calibri"/>
       <w:i/>
       <w:iCs/>
-      <w:color w:val="4F81BD" w:themeColor="accent1"/>
+      <w:color w:val="4F81BD"/>
       <w:spacing w:val="15"/>
       <w:sz w:val="24"/>
       <w:szCs w:val="24"/>

</xml_diff>

<commit_message>
docs: structure-upgrade DevPod/Mirror/AKS; add AKS and Skynet build Word docs
Combined-style structure for DevPod runbook, Local GitHub Mirror, and AKS
mercury-staging: summary table, mistake/critical red callouts, numbered File
sections with full manifests (or corrected main.tf), Restore + kubectl/Linux
appendices. Adds AKS-mercury-staging-build.docx and Skynet-Build-2026-09-30.docx
to docs/ on main.
</commit_message>
<xml_diff>
--- a/docs/Homelab_DevPod_on_Skynet_Runbook.docx
+++ b/docs/Homelab_DevPod_on_Skynet_Runbook.docx
@@ -31,7 +31,922 @@
           <w:color w:val="333333"/>
           <w:sz w:val="20"/>
         </w:rPr>
-        <w:t>Completed / verified: 2026-09-12–13 · Flux apps/base/devpod · workspace cluster-dashboard Running · preferred editor: vim over SSH</w:t>
+        <w:t>Completed / verified: 2026-09-12–13 · Flux apps/base/devpod · workspace cluster-dashboard Running · preferred editor: vim over SSH · Structure upgraded 2026-10-05 (combined style)</w:t>
+      </w:r>
+    </w:p>
+    <w:tbl>
+      <w:tblPr>
+        <w:tblStyle w:val="LightShading-Accent1"/>
+        <w:tblW w:type="auto" w:w="0"/>
+        <w:tblLayout w:type="fixed"/>
+        <w:tblLook w:firstColumn="1" w:firstRow="1" w:lastColumn="0" w:lastRow="0" w:noHBand="0" w:noVBand="1" w:val="04A0"/>
+        <w:tblBorders>
+          <w:top w:val="single" w:sz="8" w:space="0" w:color="4F81BD"/>
+          <w:left w:val="nil"/>
+          <w:bottom w:val="single" w:sz="8" w:space="0" w:color="4F81BD"/>
+          <w:right w:val="nil"/>
+          <w:insideH w:val="nil"/>
+          <w:insideV w:val="nil"/>
+        </w:tblBorders>
+      </w:tblPr>
+      <w:tblGrid>
+        <w:gridCol w:w="2592"/>
+        <w:gridCol w:w="7488"/>
+      </w:tblGrid>
+      <w:tr>
+        <w:trPr>
+          <w:cantSplit/>
+          <w:tblHeader w:val="true"/>
+        </w:trPr>
+        <w:tc>
+          <w:tcPr>
+            <w:tcW w:type="dxa" w:w="2592"/>
+            <w:tcBorders>
+              <w:top w:val="single" w:sz="8" w:space="0" w:color="4F81BD"/>
+              <w:bottom w:val="single" w:sz="8" w:space="0" w:color="4F81BD"/>
+            </w:tcBorders>
+            <w:shd w:val="clear" w:color="auto" w:fill="365F91"/>
+          </w:tcPr>
+          <w:p>
+            <w:pPr>
+              <w:keepNext/>
+              <w:spacing w:before="40" w:after="40" w:line="240" w:lineRule="auto"/>
+            </w:pPr>
+            <w:r/>
+            <w:r>
+              <w:rPr>
+                <w:b/>
+                <w:color w:val="FFFFFF"/>
+                <w:sz w:val="20"/>
+              </w:rPr>
+              <w:t>Field</w:t>
+            </w:r>
+          </w:p>
+        </w:tc>
+        <w:tc>
+          <w:tcPr>
+            <w:tcW w:type="dxa" w:w="7488"/>
+            <w:tcBorders>
+              <w:top w:val="single" w:sz="8" w:space="0" w:color="4F81BD"/>
+              <w:bottom w:val="single" w:sz="8" w:space="0" w:color="4F81BD"/>
+            </w:tcBorders>
+            <w:shd w:val="clear" w:color="auto" w:fill="365F91"/>
+          </w:tcPr>
+          <w:p>
+            <w:pPr>
+              <w:keepNext/>
+              <w:spacing w:before="40" w:after="40" w:line="240" w:lineRule="auto"/>
+            </w:pPr>
+            <w:r/>
+            <w:r>
+              <w:rPr>
+                <w:b/>
+                <w:color w:val="FFFFFF"/>
+                <w:sz w:val="20"/>
+              </w:rPr>
+              <w:t>Value</w:t>
+            </w:r>
+          </w:p>
+        </w:tc>
+      </w:tr>
+      <w:tr>
+        <w:trPr>
+          <w:cantSplit/>
+        </w:trPr>
+        <w:tc>
+          <w:tcPr>
+            <w:tcW w:type="dxa" w:w="2592"/>
+            <w:shd w:val="clear" w:color="auto" w:fill="D3DFEE"/>
+          </w:tcPr>
+          <w:p>
+            <w:pPr>
+              <w:spacing w:before="40" w:after="40" w:line="240" w:lineRule="auto"/>
+            </w:pPr>
+            <w:r/>
+            <w:r>
+              <w:rPr>
+                <w:b/>
+                <w:color w:val="173A53"/>
+                <w:sz w:val="20"/>
+              </w:rPr>
+              <w:t>Cluster</w:t>
+            </w:r>
+          </w:p>
+        </w:tc>
+        <w:tc>
+          <w:tcPr>
+            <w:tcW w:type="dxa" w:w="7488"/>
+            <w:shd w:val="clear" w:color="auto" w:fill="D3DFEE"/>
+          </w:tcPr>
+          <w:p>
+            <w:pPr>
+              <w:spacing w:before="40" w:after="40" w:line="240" w:lineRule="auto"/>
+            </w:pPr>
+            <w:r/>
+            <w:r>
+              <w:rPr>
+                <w:color w:val="1A1A1A"/>
+                <w:sz w:val="20"/>
+              </w:rPr>
+              <w:t>k3s skynet, API VIP 192.168.68.40:6443, linux/amd64 workers</w:t>
+            </w:r>
+          </w:p>
+        </w:tc>
+      </w:tr>
+      <w:tr>
+        <w:trPr>
+          <w:cantSplit/>
+        </w:trPr>
+        <w:tc>
+          <w:tcPr>
+            <w:tcW w:type="dxa" w:w="2592"/>
+            <w:shd w:val="clear" w:color="auto" w:fill="FFFFFF"/>
+          </w:tcPr>
+          <w:p>
+            <w:pPr>
+              <w:spacing w:before="40" w:after="40" w:line="240" w:lineRule="auto"/>
+            </w:pPr>
+            <w:r/>
+            <w:r>
+              <w:rPr>
+                <w:b/>
+                <w:color w:val="173A53"/>
+                <w:sz w:val="20"/>
+              </w:rPr>
+              <w:t>Wrong storage for workspace</w:t>
+            </w:r>
+          </w:p>
+        </w:tc>
+        <w:tc>
+          <w:tcPr>
+            <w:tcW w:type="dxa" w:w="7488"/>
+            <w:shd w:val="clear" w:color="auto" w:fill="FFFFFF"/>
+          </w:tcPr>
+          <w:p>
+            <w:pPr>
+              <w:spacing w:before="40" w:after="40" w:line="240" w:lineRule="auto"/>
+            </w:pPr>
+            <w:r>
+              <w:rPr>
+                <w:b/>
+                <w:color w:val="A52A23"/>
+              </w:rPr>
+            </w:r>
+            <w:r>
+              <w:rPr>
+                <w:b/>
+                <w:color w:val="A52A23"/>
+                <w:sz w:val="20"/>
+              </w:rPr>
+              <w:t>SMB / 32TB_SSD for DevPod home or code PVC</w:t>
+            </w:r>
+          </w:p>
+        </w:tc>
+      </w:tr>
+      <w:tr>
+        <w:trPr>
+          <w:cantSplit/>
+        </w:trPr>
+        <w:tc>
+          <w:tcPr>
+            <w:tcW w:type="dxa" w:w="2592"/>
+            <w:shd w:val="clear" w:color="auto" w:fill="D3DFEE"/>
+          </w:tcPr>
+          <w:p>
+            <w:pPr>
+              <w:spacing w:before="40" w:after="40" w:line="240" w:lineRule="auto"/>
+            </w:pPr>
+            <w:r/>
+            <w:r>
+              <w:rPr>
+                <w:b/>
+                <w:color w:val="173A53"/>
+                <w:sz w:val="20"/>
+              </w:rPr>
+              <w:t>Correct workspace PVC</w:t>
+            </w:r>
+          </w:p>
+        </w:tc>
+        <w:tc>
+          <w:tcPr>
+            <w:tcW w:type="dxa" w:w="7488"/>
+            <w:shd w:val="clear" w:color="auto" w:fill="D3DFEE"/>
+          </w:tcPr>
+          <w:p>
+            <w:pPr>
+              <w:spacing w:before="40" w:after="40" w:line="240" w:lineRule="auto"/>
+            </w:pPr>
+            <w:r/>
+            <w:r>
+              <w:rPr>
+                <w:color w:val="1A1A1A"/>
+                <w:sz w:val="20"/>
+              </w:rPr>
+              <w:t>Longhorn RWO ~40Gi per workspace (not SMB)</w:t>
+            </w:r>
+          </w:p>
+        </w:tc>
+      </w:tr>
+      <w:tr>
+        <w:trPr>
+          <w:cantSplit/>
+        </w:trPr>
+        <w:tc>
+          <w:tcPr>
+            <w:tcW w:type="dxa" w:w="2592"/>
+            <w:shd w:val="clear" w:color="auto" w:fill="FFFFFF"/>
+          </w:tcPr>
+          <w:p>
+            <w:pPr>
+              <w:spacing w:before="40" w:after="40" w:line="240" w:lineRule="auto"/>
+            </w:pPr>
+            <w:r/>
+            <w:r>
+              <w:rPr>
+                <w:b/>
+                <w:color w:val="173A53"/>
+                <w:sz w:val="20"/>
+              </w:rPr>
+              <w:t>Scratch PVC</w:t>
+            </w:r>
+          </w:p>
+        </w:tc>
+        <w:tc>
+          <w:tcPr>
+            <w:tcW w:type="dxa" w:w="7488"/>
+            <w:shd w:val="clear" w:color="auto" w:fill="FFFFFF"/>
+          </w:tcPr>
+          <w:p>
+            <w:pPr>
+              <w:spacing w:before="40" w:after="40" w:line="240" w:lineRule="auto"/>
+            </w:pPr>
+            <w:r/>
+            <w:r>
+              <w:rPr>
+                <w:color w:val="1A1A1A"/>
+                <w:sz w:val="20"/>
+              </w:rPr>
+              <w:t>devpod/devpod-scratch 500Gi RWX, SC smb-32tb-devstorage → //192.168.71.249/G/DevStorage</w:t>
+            </w:r>
+          </w:p>
+        </w:tc>
+      </w:tr>
+      <w:tr>
+        <w:trPr>
+          <w:cantSplit/>
+        </w:trPr>
+        <w:tc>
+          <w:tcPr>
+            <w:tcW w:type="dxa" w:w="2592"/>
+            <w:shd w:val="clear" w:color="auto" w:fill="D3DFEE"/>
+          </w:tcPr>
+          <w:p>
+            <w:pPr>
+              <w:spacing w:before="40" w:after="40" w:line="240" w:lineRule="auto"/>
+            </w:pPr>
+            <w:r/>
+            <w:r>
+              <w:rPr>
+                <w:b/>
+                <w:color w:val="173A53"/>
+                <w:sz w:val="20"/>
+              </w:rPr>
+              <w:t>Namespace</w:t>
+            </w:r>
+          </w:p>
+        </w:tc>
+        <w:tc>
+          <w:tcPr>
+            <w:tcW w:type="dxa" w:w="7488"/>
+            <w:shd w:val="clear" w:color="auto" w:fill="D3DFEE"/>
+          </w:tcPr>
+          <w:p>
+            <w:pPr>
+              <w:spacing w:before="40" w:after="40" w:line="240" w:lineRule="auto"/>
+            </w:pPr>
+            <w:r/>
+            <w:r>
+              <w:rPr>
+                <w:color w:val="1A1A1A"/>
+                <w:sz w:val="20"/>
+              </w:rPr>
+              <w:t>devpod (Flux-owned; CREATE_NAMESPACE=false on the provider)</w:t>
+            </w:r>
+          </w:p>
+        </w:tc>
+      </w:tr>
+      <w:tr>
+        <w:trPr>
+          <w:cantSplit/>
+        </w:trPr>
+        <w:tc>
+          <w:tcPr>
+            <w:tcW w:type="dxa" w:w="2592"/>
+            <w:shd w:val="clear" w:color="auto" w:fill="FFFFFF"/>
+          </w:tcPr>
+          <w:p>
+            <w:pPr>
+              <w:spacing w:before="40" w:after="40" w:line="240" w:lineRule="auto"/>
+            </w:pPr>
+            <w:r/>
+            <w:r>
+              <w:rPr>
+                <w:b/>
+                <w:color w:val="173A53"/>
+                <w:sz w:val="20"/>
+              </w:rPr>
+              <w:t>Provider</w:t>
+            </w:r>
+          </w:p>
+        </w:tc>
+        <w:tc>
+          <w:tcPr>
+            <w:tcW w:type="dxa" w:w="7488"/>
+            <w:shd w:val="clear" w:color="auto" w:fill="FFFFFF"/>
+          </w:tcPr>
+          <w:p>
+            <w:pPr>
+              <w:spacing w:before="40" w:after="40" w:line="240" w:lineRule="auto"/>
+            </w:pPr>
+            <w:r/>
+            <w:r>
+              <w:rPr>
+                <w:color w:val="1A1A1A"/>
+                <w:sz w:val="20"/>
+              </w:rPr>
+              <w:t>DevPod kubernetes provider named skynet on M5</w:t>
+            </w:r>
+          </w:p>
+        </w:tc>
+      </w:tr>
+      <w:tr>
+        <w:trPr>
+          <w:cantSplit/>
+        </w:trPr>
+        <w:tc>
+          <w:tcPr>
+            <w:tcW w:type="dxa" w:w="2592"/>
+            <w:shd w:val="clear" w:color="auto" w:fill="D3DFEE"/>
+          </w:tcPr>
+          <w:p>
+            <w:pPr>
+              <w:spacing w:before="40" w:after="40" w:line="240" w:lineRule="auto"/>
+            </w:pPr>
+            <w:r/>
+            <w:r>
+              <w:rPr>
+                <w:b/>
+                <w:color w:val="173A53"/>
+                <w:sz w:val="20"/>
+              </w:rPr>
+              <w:t>Pod template</w:t>
+            </w:r>
+          </w:p>
+        </w:tc>
+        <w:tc>
+          <w:tcPr>
+            <w:tcW w:type="dxa" w:w="7488"/>
+            <w:shd w:val="clear" w:color="auto" w:fill="D3DFEE"/>
+          </w:tcPr>
+          <w:p>
+            <w:pPr>
+              <w:spacing w:before="40" w:after="40" w:line="240" w:lineRule="auto"/>
+            </w:pPr>
+            <w:r/>
+            <w:r>
+              <w:rPr>
+                <w:color w:val="1A1A1A"/>
+                <w:sz w:val="20"/>
+              </w:rPr>
+              <w:t>~/.config/devpod/skynet-pod-template.yaml mounts /scratch</w:t>
+            </w:r>
+          </w:p>
+        </w:tc>
+      </w:tr>
+      <w:tr>
+        <w:trPr>
+          <w:cantSplit/>
+        </w:trPr>
+        <w:tc>
+          <w:tcPr>
+            <w:tcW w:type="dxa" w:w="2592"/>
+            <w:shd w:val="clear" w:color="auto" w:fill="FFFFFF"/>
+          </w:tcPr>
+          <w:p>
+            <w:pPr>
+              <w:spacing w:before="40" w:after="40" w:line="240" w:lineRule="auto"/>
+            </w:pPr>
+            <w:r/>
+            <w:r>
+              <w:rPr>
+                <w:b/>
+                <w:color w:val="173A53"/>
+                <w:sz w:val="20"/>
+              </w:rPr>
+              <w:t>Files in Git</w:t>
+            </w:r>
+          </w:p>
+        </w:tc>
+        <w:tc>
+          <w:tcPr>
+            <w:tcW w:type="dxa" w:w="7488"/>
+            <w:shd w:val="clear" w:color="auto" w:fill="FFFFFF"/>
+          </w:tcPr>
+          <w:p>
+            <w:pPr>
+              <w:spacing w:before="40" w:after="40" w:line="240" w:lineRule="auto"/>
+            </w:pPr>
+            <w:r/>
+            <w:r>
+              <w:rPr>
+                <w:color w:val="1A1A1A"/>
+                <w:sz w:val="20"/>
+              </w:rPr>
+              <w:t>apps/base/devpod/* (ns/quota/limits/scratch), infrastructure/controllers/base/csi-smb/storage-class-32tb*.yaml, apps/staging/devpod/kustomization.yaml + SOPS secrets</w:t>
+            </w:r>
+          </w:p>
+        </w:tc>
+      </w:tr>
+      <w:tr>
+        <w:trPr>
+          <w:cantSplit/>
+        </w:trPr>
+        <w:tc>
+          <w:tcPr>
+            <w:tcW w:type="dxa" w:w="2592"/>
+            <w:shd w:val="clear" w:color="auto" w:fill="D3DFEE"/>
+          </w:tcPr>
+          <w:p>
+            <w:pPr>
+              <w:spacing w:before="40" w:after="40" w:line="240" w:lineRule="auto"/>
+            </w:pPr>
+            <w:r/>
+            <w:r>
+              <w:rPr>
+                <w:b/>
+                <w:color w:val="173A53"/>
+                <w:sz w:val="20"/>
+              </w:rPr>
+              <w:t>Example workspace</w:t>
+            </w:r>
+          </w:p>
+        </w:tc>
+        <w:tc>
+          <w:tcPr>
+            <w:tcW w:type="dxa" w:w="7488"/>
+            <w:shd w:val="clear" w:color="auto" w:fill="D3DFEE"/>
+          </w:tcPr>
+          <w:p>
+            <w:pPr>
+              <w:spacing w:before="40" w:after="40" w:line="240" w:lineRule="auto"/>
+            </w:pPr>
+            <w:r/>
+            <w:r>
+              <w:rPr>
+                <w:color w:val="1A1A1A"/>
+                <w:sz w:val="20"/>
+              </w:rPr>
+              <w:t>github.com/Invertedlight/cluster-dashboard · SSH cluster-dashboard.devpod</w:t>
+            </w:r>
+          </w:p>
+        </w:tc>
+      </w:tr>
+      <w:tr>
+        <w:trPr>
+          <w:cantSplit/>
+        </w:trPr>
+        <w:tc>
+          <w:tcPr>
+            <w:tcW w:type="dxa" w:w="2592"/>
+            <w:shd w:val="clear" w:color="auto" w:fill="FFFFFF"/>
+          </w:tcPr>
+          <w:p>
+            <w:pPr>
+              <w:spacing w:before="40" w:after="40" w:line="240" w:lineRule="auto"/>
+            </w:pPr>
+            <w:r/>
+            <w:r>
+              <w:rPr>
+                <w:b/>
+                <w:color w:val="173A53"/>
+                <w:sz w:val="20"/>
+              </w:rPr>
+              <w:t>Later evolution</w:t>
+            </w:r>
+          </w:p>
+        </w:tc>
+        <w:tc>
+          <w:tcPr>
+            <w:tcW w:type="dxa" w:w="7488"/>
+            <w:shd w:val="clear" w:color="auto" w:fill="FFFFFF"/>
+          </w:tcPr>
+          <w:p>
+            <w:pPr>
+              <w:spacing w:before="40" w:after="40" w:line="240" w:lineRule="auto"/>
+            </w:pPr>
+            <w:r/>
+            <w:r>
+              <w:rPr>
+                <w:color w:val="1A1A1A"/>
+                <w:sz w:val="20"/>
+              </w:rPr>
+              <w:t>See DevPod Enhancements / NodePort / Cloudflare SSH addenda for StatefulSet era</w:t>
+            </w:r>
+          </w:p>
+        </w:tc>
+      </w:tr>
+    </w:tbl>
+    <w:p>
+      <w:pPr>
+        <w:spacing w:after="40" w:line="120" w:lineRule="exact"/>
+      </w:pPr>
+    </w:p>
+    <w:p>
+      <w:pPr>
+        <w:pStyle w:val="Heading1"/>
+      </w:pPr>
+      <w:r>
+        <w:t>1. Mistakes</w:t>
+      </w:r>
+    </w:p>
+    <w:p>
+      <w:pPr>
+        <w:shd w:val="clear" w:color="auto" w:fill="FBEAEA"/>
+        <w:keepNext/>
+        <w:keepLines/>
+        <w:pBdr>
+          <w:left w:val="single" w:sz="36" w:space="6" w:color="A52A23"/>
+        </w:pBdr>
+        <w:spacing w:before="40" w:after="0"/>
+        <w:ind w:left="144" w:right="86"/>
+      </w:pPr>
+      <w:r>
+        <w:rPr>
+          <w:rFonts w:ascii="Calibri" w:hAnsi="Calibri" w:eastAsia="Calibri"/>
+          <w:b/>
+          <w:color w:val="A52A23"/>
+        </w:rPr>
+        <w:t xml:space="preserve">MISTAKE  </w:t>
+      </w:r>
+      <w:r>
+        <w:rPr>
+          <w:rFonts w:ascii="Calibri" w:hAnsi="Calibri" w:eastAsia="Calibri"/>
+          <w:b/>
+          <w:color w:val="A52A23"/>
+        </w:rPr>
+        <w:t>putting the DevPod workspace (home / code) on SMB or the 32TB_SSD.</w:t>
+      </w:r>
+      <w:r>
+        <w:br/>
+      </w:r>
+      <w:r>
+        <w:rPr>
+          <w:rFonts w:ascii="Calibri" w:hAnsi="Calibri" w:eastAsia="Calibri"/>
+          <w:b/>
+          <w:color w:val="A52A23"/>
+        </w:rPr>
+        <w:t>Git and IDE tooling hate flaky USB/SMB latency and locks. A workspace PVC on SMB leads to corrupt index locks, stuck editors, and PVC detach pain when the share blips.</w:t>
+      </w:r>
+      <w:r>
+        <w:br/>
+      </w:r>
+      <w:r>
+        <w:rPr>
+          <w:rFonts w:ascii="Calibri" w:hAnsi="Calibri" w:eastAsia="Calibri"/>
+          <w:b/>
+          <w:color w:val="A52A23"/>
+        </w:rPr>
+        <w:t>Never put the DevPod workspace PVC, Postgres, or Forgejo git data on SMB or the 32TB appliance.</w:t>
+      </w:r>
+      <w:r>
+        <w:br/>
+      </w:r>
+      <w:r>
+        <w:rPr>
+          <w:rFonts w:ascii="Calibri" w:hAnsi="Calibri" w:eastAsia="Calibri"/>
+          <w:b/>
+          <w:color w:val="A52A23"/>
+        </w:rPr>
+        <w:t>Scratch only belongs on SMB (disposable builds/datasets at /scratch).</w:t>
+      </w:r>
+    </w:p>
+    <w:p>
+      <w:pPr>
+        <w:shd w:val="clear" w:color="auto" w:fill="FBEAEA"/>
+        <w:keepNext/>
+        <w:keepLines/>
+        <w:pBdr>
+          <w:left w:val="single" w:sz="36" w:space="6" w:color="A52A23"/>
+        </w:pBdr>
+        <w:spacing w:before="80" w:after="0"/>
+        <w:ind w:left="144" w:right="86"/>
+      </w:pPr>
+      <w:r>
+        <w:rPr>
+          <w:rFonts w:ascii="Calibri" w:hAnsi="Calibri" w:eastAsia="Calibri"/>
+          <w:b/>
+          <w:color w:val="A52A23"/>
+          <w:sz w:val="20"/>
+        </w:rPr>
+        <w:t>Observed failure</w:t>
+      </w:r>
+    </w:p>
+    <w:p>
+      <w:pPr>
+        <w:shd w:val="clear" w:color="auto" w:fill="FBEAEA"/>
+        <w:keepNext/>
+        <w:keepLines/>
+        <w:pBdr>
+          <w:left w:val="single" w:sz="36" w:space="6" w:color="A52A23"/>
+        </w:pBdr>
+        <w:spacing w:before="0" w:after="0" w:line="240" w:lineRule="auto"/>
+        <w:ind w:left="144" w:right="86"/>
+      </w:pPr>
+      <w:r>
+        <w:rPr>
+          <w:rFonts w:ascii="Courier New" w:hAnsi="Courier New" w:eastAsia="Courier New"/>
+          <w:b w:val="0"/>
+          <w:color w:val="A52A23"/>
+          <w:sz w:val="18"/>
+        </w:rPr>
+        <w:t>Design rule recorded 2026-09-12: workspace home/code on Longhorn RWO (not SMB).</w:t>
+      </w:r>
+    </w:p>
+    <w:p>
+      <w:pPr>
+        <w:shd w:val="clear" w:color="auto" w:fill="FBEAEA"/>
+        <w:keepLines/>
+        <w:pBdr>
+          <w:left w:val="single" w:sz="36" w:space="6" w:color="A52A23"/>
+        </w:pBdr>
+        <w:spacing w:before="80" w:after="180"/>
+        <w:ind w:left="144" w:right="86"/>
+      </w:pPr>
+      <w:r>
+        <w:rPr>
+          <w:rFonts w:ascii="Calibri" w:hAnsi="Calibri" w:eastAsia="Calibri"/>
+          <w:b/>
+          <w:color w:val="A52A23"/>
+        </w:rPr>
+        <w:t xml:space="preserve">Also wrong  </w:t>
+      </w:r>
+      <w:r>
+        <w:rPr>
+          <w:rFonts w:ascii="Calibri" w:hAnsi="Calibri" w:eastAsia="Calibri"/>
+          <w:b/>
+          <w:color w:val="A52A23"/>
+        </w:rPr>
+        <w:t>Putting a sole copy of source or a database on the shared RWX scratch PVC.</w:t>
+      </w:r>
+    </w:p>
+    <w:p>
+      <w:r>
+        <w:rPr>
+          <w:b/>
+          <w:color w:val="173A53"/>
+        </w:rPr>
+        <w:t xml:space="preserve">Fix  </w:t>
+      </w:r>
+      <w:r>
+        <w:t>Section 5–8 and 13: Longhorn STORAGE_CLASS=longhorn, DISK_SIZE=40Gi, PVC_ACCESS_MODE=RWO; scratch is a separate PVC on smb-32tb-devstorage mounted at /scratch.</w:t>
+      </w:r>
+    </w:p>
+    <w:p>
+      <w:pPr>
+        <w:shd w:val="clear" w:color="auto" w:fill="FBEAEA"/>
+        <w:keepNext/>
+        <w:keepLines/>
+        <w:pBdr>
+          <w:left w:val="single" w:sz="36" w:space="6" w:color="A52A23"/>
+        </w:pBdr>
+        <w:spacing w:before="40" w:after="0"/>
+        <w:ind w:left="144" w:right="86"/>
+      </w:pPr>
+      <w:r>
+        <w:rPr>
+          <w:rFonts w:ascii="Calibri" w:hAnsi="Calibri" w:eastAsia="Calibri"/>
+          <w:b/>
+          <w:color w:val="A52A23"/>
+        </w:rPr>
+        <w:t xml:space="preserve">MISTAKE  </w:t>
+      </w:r>
+      <w:r>
+        <w:rPr>
+          <w:rFonts w:ascii="Calibri" w:hAnsi="Calibri" w:eastAsia="Calibri"/>
+          <w:b/>
+          <w:color w:val="A52A23"/>
+        </w:rPr>
+        <w:t>CREATE_NAMESPACE=true on the DevPod kubernetes provider.</w:t>
+      </w:r>
+      <w:r>
+        <w:br/>
+      </w:r>
+      <w:r>
+        <w:rPr>
+          <w:rFonts w:ascii="Calibri" w:hAnsi="Calibri" w:eastAsia="Calibri"/>
+          <w:b/>
+          <w:color w:val="A52A23"/>
+        </w:rPr>
+        <w:t>Flux owns Namespace devpod (and its ResourceQuota / LimitRange). Letting DevPod create the namespace fights GitOps and can drop quota/limits on recreate.</w:t>
+      </w:r>
+      <w:r>
+        <w:br/>
+      </w:r>
+      <w:r>
+        <w:rPr>
+          <w:rFonts w:ascii="Calibri" w:hAnsi="Calibri" w:eastAsia="Calibri"/>
+          <w:b/>
+          <w:color w:val="A52A23"/>
+        </w:rPr>
+        <w:t>Do not set CREATE_NAMESPACE=true for provider skynet.</w:t>
+      </w:r>
+    </w:p>
+    <w:p>
+      <w:pPr>
+        <w:shd w:val="clear" w:color="auto" w:fill="FBEAEA"/>
+        <w:keepNext/>
+        <w:keepLines/>
+        <w:pBdr>
+          <w:left w:val="single" w:sz="36" w:space="6" w:color="A52A23"/>
+        </w:pBdr>
+        <w:spacing w:before="80" w:after="0"/>
+        <w:ind w:left="144" w:right="86"/>
+      </w:pPr>
+      <w:r>
+        <w:rPr>
+          <w:rFonts w:ascii="Calibri" w:hAnsi="Calibri" w:eastAsia="Calibri"/>
+          <w:b/>
+          <w:color w:val="A52A23"/>
+          <w:sz w:val="20"/>
+        </w:rPr>
+        <w:t>Observed failure</w:t>
+      </w:r>
+    </w:p>
+    <w:p>
+      <w:pPr>
+        <w:shd w:val="clear" w:color="auto" w:fill="FBEAEA"/>
+        <w:keepLines/>
+        <w:pBdr>
+          <w:left w:val="single" w:sz="36" w:space="6" w:color="A52A23"/>
+        </w:pBdr>
+        <w:spacing w:before="0" w:after="180" w:line="240" w:lineRule="auto"/>
+        <w:ind w:left="144" w:right="86"/>
+      </w:pPr>
+      <w:r>
+        <w:rPr>
+          <w:rFonts w:ascii="Courier New" w:hAnsi="Courier New" w:eastAsia="Courier New"/>
+          <w:b w:val="0"/>
+          <w:color w:val="A52A23"/>
+          <w:sz w:val="18"/>
+        </w:rPr>
+        <w:t>Provider option CREATE_NAMESPACE must be false; Flux manifests create ns/devpod.</w:t>
+      </w:r>
+    </w:p>
+    <w:p>
+      <w:r>
+        <w:rPr>
+          <w:b/>
+          <w:color w:val="173A53"/>
+        </w:rPr>
+        <w:t xml:space="preserve">Fix  </w:t>
+      </w:r>
+      <w:r>
+        <w:t>Section 14 provider table: CREATE_NAMESPACE=false, KUBERNETES_NAMESPACE=devpod.</w:t>
+      </w:r>
+    </w:p>
+    <w:p>
+      <w:pPr>
+        <w:shd w:val="clear" w:color="auto" w:fill="FBEAEA"/>
+        <w:keepNext/>
+        <w:keepLines/>
+        <w:pBdr>
+          <w:left w:val="single" w:sz="36" w:space="6" w:color="A52A23"/>
+        </w:pBdr>
+        <w:spacing w:before="40" w:after="0"/>
+        <w:ind w:left="144" w:right="86"/>
+      </w:pPr>
+      <w:r>
+        <w:rPr>
+          <w:rFonts w:ascii="Calibri" w:hAnsi="Calibri" w:eastAsia="Calibri"/>
+          <w:b/>
+          <w:color w:val="A52A23"/>
+        </w:rPr>
+        <w:t xml:space="preserve">MISTAKE  </w:t>
+      </w:r>
+      <w:r>
+        <w:rPr>
+          <w:rFonts w:ascii="Calibri" w:hAnsi="Calibri" w:eastAsia="Calibri"/>
+          <w:b/>
+          <w:color w:val="A52A23"/>
+        </w:rPr>
+        <w:t>treating a stuck Cursor Remote-SSH "Extracting…" as a full disk on the workspace PVC.</w:t>
+      </w:r>
+      <w:r>
+        <w:br/>
+      </w:r>
+      <w:r>
+        <w:rPr>
+          <w:rFonts w:ascii="Calibri" w:hAnsi="Calibri" w:eastAsia="Calibri"/>
+          <w:b/>
+          <w:color w:val="A52A23"/>
+        </w:rPr>
+        <w:t>Cursor downloads ~/.cursor-server onto the container overlay (node disk), not the Longhorn workspace PVC. A stuck install heartbeat can keep spinning after the tarball has already unpacked.</w:t>
+      </w:r>
+      <w:r>
+        <w:br/>
+      </w:r>
+      <w:r>
+        <w:rPr>
+          <w:rFonts w:ascii="Calibri" w:hAnsi="Calibri" w:eastAsia="Calibri"/>
+          <w:b/>
+          <w:color w:val="A52A23"/>
+        </w:rPr>
+        <w:t>Do not delete the Longhorn PVC to "fix" Cursor.</w:t>
+      </w:r>
+    </w:p>
+    <w:p>
+      <w:pPr>
+        <w:shd w:val="clear" w:color="auto" w:fill="FBEAEA"/>
+        <w:keepNext/>
+        <w:keepLines/>
+        <w:pBdr>
+          <w:left w:val="single" w:sz="36" w:space="6" w:color="A52A23"/>
+        </w:pBdr>
+        <w:spacing w:before="80" w:after="0"/>
+        <w:ind w:left="144" w:right="86"/>
+      </w:pPr>
+      <w:r>
+        <w:rPr>
+          <w:rFonts w:ascii="Calibri" w:hAnsi="Calibri" w:eastAsia="Calibri"/>
+          <w:b/>
+          <w:color w:val="A52A23"/>
+          <w:sz w:val="20"/>
+        </w:rPr>
+        <w:t>Observed failure</w:t>
+      </w:r>
+    </w:p>
+    <w:p>
+      <w:pPr>
+        <w:shd w:val="clear" w:color="auto" w:fill="FBEAEA"/>
+        <w:keepLines/>
+        <w:pBdr>
+          <w:left w:val="single" w:sz="36" w:space="6" w:color="A52A23"/>
+        </w:pBdr>
+        <w:spacing w:before="0" w:after="180" w:line="240" w:lineRule="auto"/>
+        <w:ind w:left="144" w:right="86"/>
+      </w:pPr>
+      <w:r>
+        <w:rPr>
+          <w:rFonts w:ascii="Courier New" w:hAnsi="Courier New" w:eastAsia="Courier New"/>
+          <w:b w:val="0"/>
+          <w:color w:val="A52A23"/>
+          <w:sz w:val="18"/>
+        </w:rPr>
+        <w:t>Stuck Extracting… while server tarball had finished unpacking;</w:t>
+        <w:br/>
+        <w:t>workspace PVC nearly empty; node root ~26% used; /scratch nearly empty (2026-09-12).</w:t>
+      </w:r>
+    </w:p>
+    <w:p>
+      <w:r>
+        <w:rPr>
+          <w:b/>
+          <w:color w:val="173A53"/>
+        </w:rPr>
+        <w:t xml:space="preserve">Fix  </w:t>
+      </w:r>
+      <w:r>
+        <w:t>Kill the stuck install SSH, clear /tmp/cursor-remote-lock.*, remove leftover cursor-server-*.tar.gz under ~/.cursor-server, reconnect — or skip Cursor and use vim (section 15).</w:t>
+      </w:r>
+    </w:p>
+    <w:p>
+      <w:pPr>
+        <w:shd w:val="clear" w:color="auto" w:fill="FBEAEA"/>
+        <w:keepLines/>
+        <w:pBdr>
+          <w:left w:val="single" w:sz="36" w:space="6" w:color="A52A23"/>
+        </w:pBdr>
+        <w:spacing w:before="40" w:after="180"/>
+        <w:ind w:left="144" w:right="86"/>
+      </w:pPr>
+      <w:r>
+        <w:rPr>
+          <w:rFonts w:ascii="Calibri" w:hAnsi="Calibri" w:eastAsia="Calibri"/>
+          <w:b/>
+          <w:color w:val="A52A23"/>
+        </w:rPr>
+        <w:t>CRITICAL — Do not delete a DevPod workspace PVC without confirming DevPod delete flags.</w:t>
+      </w:r>
+      <w:r>
+        <w:br/>
+      </w:r>
+      <w:r>
+        <w:rPr>
+          <w:rFonts w:ascii="Calibri" w:hAnsi="Calibri" w:eastAsia="Calibri"/>
+          <w:b/>
+          <w:color w:val="A52A23"/>
+        </w:rPr>
+        <w:t>Deleting a workspace may delete its Longhorn PVC. Confirm before destroy. Scratch is shared RWX across workspaces — do not put databases or sole copies of source there.</w:t>
       </w:r>
     </w:p>
     <w:p>
@@ -39,17 +954,36 @@
         <w:pStyle w:val="Heading1"/>
       </w:pPr>
       <w:r>
-        <w:t>1. Purpose</w:t>
+        <w:t>2. Purpose</w:t>
       </w:r>
     </w:p>
     <w:p>
       <w:r>
-        <w:t>This runbook documents how amd64 DevPod workspaces were stood up on the Flux-managed k3s cluster skynet so development happens next to production (same scheduler/network) without cross-building from the arm64 MacBook Pro M5. It covers architecture, Flux manifests, the M5 DevPod kubernetes provider, scratch storage on the 32TB_SSD appliance, day-to-day SSH/vim usage, verification, and deferred work (dashboard app runtime, public Ingress).</w:t>
+        <w:t>This runbook documents how amd64 DevPod workspaces were stood up on the Flux-managed k3s cluster skynet so development happens next to production (same scheduler/network) without cross-building from the arm64 MacBook Pro M5. It covers architecture, Flux manifests with full file contents, the M5 DevPod kubernetes provider, scratch storage on the 32TB_SSD appliance, day-to-day SSH/vim usage, verification, and deferred work.</w:t>
       </w:r>
     </w:p>
     <w:p>
+      <w:pPr>
+        <w:shd w:val="clear" w:color="auto" w:fill="D3DFEE"/>
+        <w:keepLines/>
+        <w:pBdr>
+          <w:left w:val="single" w:sz="24" w:space="6" w:color="4F81BD"/>
+        </w:pBdr>
+        <w:spacing w:before="40" w:after="180"/>
+        <w:ind w:left="115" w:right="86"/>
+      </w:pPr>
       <w:r>
-        <w:t>Design rule: workspace home/code on Longhorn RWO (not SMB). Large disposable scratch on SMB CSI against the 32TB_SSD appliance. Prefer vim via SSH (`devpod ssh` / `ssh &lt;name&gt;.devpod`) for editing; Cursor Remote-SSH into the pod is optional and was flaky on first remote-server install.</w:t>
+        <w:rPr>
+          <w:b/>
+          <w:color w:val="173A53"/>
+        </w:rPr>
+        <w:t xml:space="preserve">Scope  </w:t>
+      </w:r>
+      <w:r>
+        <w:rPr>
+          <w:color w:val="1A1A1A"/>
+        </w:rPr>
+        <w:t>After 2026-09-13 the cluster moved from per-workspace DevPod-created pods toward a Flux-managed StatefulSet, NodePort SSH, and Cloudflare tunnel access. Those changes are documented in Homelab_DevPod_Enhancements_Addendum.docx and related addenda. This runbook keeps the original Longhorn + scratch design and the Flux files needed to rebuild the namespace, quota, scratch PVC, and 32TB StorageClasses.</w:t>
       </w:r>
     </w:p>
     <w:p>
@@ -57,7 +991,7 @@
         <w:pStyle w:val="Heading1"/>
       </w:pPr>
       <w:r>
-        <w:t>2. Architecture</w:t>
+        <w:t>3. Architecture</w:t>
       </w:r>
     </w:p>
     <w:p>
@@ -73,7 +1007,7 @@
         <w:pStyle w:val="ListBullet"/>
       </w:pPr>
       <w:r>
-        <w:t>Cluster: k3s skynet, API VIP 192.168.68.40:6443, 3 CP + 3 workers, all linux/amd64.</w:t>
+        <w:t>Cluster: k3s skynet, API VIP 192.168.68.40:6443, control-plane + workers, all linux/amd64.</w:t>
       </w:r>
     </w:p>
     <w:p>
@@ -606,38 +1540,6 @@
         <w:pStyle w:val="Heading1"/>
       </w:pPr>
       <w:r>
-        <w:t>3. Why DevPod-on-Kubernetes</w:t>
-      </w:r>
-    </w:p>
-    <w:p>
-      <w:pPr>
-        <w:pStyle w:val="ListBullet"/>
-      </w:pPr>
-      <w:r>
-        <w:t>Workers are amd64; M5 is arm64 — avoid QEMU/cross builds for images meant for skynet.</w:t>
-      </w:r>
-    </w:p>
-    <w:p>
-      <w:pPr>
-        <w:pStyle w:val="ListBullet"/>
-      </w:pPr>
-      <w:r>
-        <w:t>Same CNI/DNS/Traefik path as production apps.</w:t>
-      </w:r>
-    </w:p>
-    <w:p>
-      <w:pPr>
-        <w:pStyle w:val="ListBullet"/>
-      </w:pPr>
-      <w:r>
-        <w:t>Disposable workspaces with persistent Longhorn disks; tear down IDE without losing PVC until deleted.</w:t>
-      </w:r>
-    </w:p>
-    <w:p>
-      <w:pPr>
-        <w:pStyle w:val="Heading1"/>
-      </w:pPr>
-      <w:r>
         <w:t>4. Storage split</w:t>
       </w:r>
     </w:p>
@@ -1131,49 +2033,20 @@
         <w:pStyle w:val="Heading1"/>
       </w:pPr>
       <w:r>
-        <w:t>5. Flux manifests</w:t>
+        <w:t>5. File: apps/base/devpod/namespace.yaml</w:t>
       </w:r>
     </w:p>
     <w:p>
       <w:r>
-        <w:t>Path under homelab-cluster checkout (/Users/cyberstar/homelab-cluster):</w:t>
+        <w:t>Flux-owned Namespace for all DevPod workspaces and the shared scratch PVC.</w:t>
       </w:r>
     </w:p>
     <w:p>
       <w:pPr>
-        <w:pStyle w:val="ListBullet"/>
+        <w:pStyle w:val="Heading3"/>
       </w:pPr>
       <w:r>
-        <w:t>apps/base/devpod — Namespace, ResourceQuota (storage 3Ti), LimitRange (PVC max 2Ti).</w:t>
-      </w:r>
-    </w:p>
-    <w:p>
-      <w:pPr>
-        <w:pStyle w:val="ListBullet"/>
-      </w:pPr>
-      <w:r>
-        <w:t>apps/staging/devpod — staging overlay wiring.</w:t>
-      </w:r>
-    </w:p>
-    <w:p>
-      <w:pPr>
-        <w:pStyle w:val="ListBullet"/>
-      </w:pPr>
-      <w:r>
-        <w:t>StorageClasses smb-32tb and smb-32tb-devstorage + SOPS secret smb-32tb-credentials in ns devpod.</w:t>
-      </w:r>
-    </w:p>
-    <w:p>
-      <w:pPr>
-        <w:pStyle w:val="ListBullet"/>
-      </w:pPr>
-      <w:r>
-        <w:t>Notable commits: b1444fa (ns/quota), 749b665 / 4251e0e (32TB SMB classes + scratch PVC).</w:t>
-      </w:r>
-    </w:p>
-    <w:p>
-      <w:r>
-        <w:t>Verify:</w:t>
+        <w:t>Full file</w:t>
       </w:r>
     </w:p>
     <w:p>
@@ -1189,9 +2062,19 @@
           <w:color w:val="000000"/>
           <w:sz w:val="19"/>
         </w:rPr>
-        <w:t>kubectl -n devpod get ns,resourcequota,limitrange,pvc</w:t>
+        <w:t>apiVersion: v1</w:t>
         <w:br/>
-        <w:t>kubectl get sc | egrep 'longhorn|smb'</w:t>
+        <w:t>kind: Namespace</w:t>
+        <w:br/>
+        <w:t>metadata:</w:t>
+        <w:br/>
+        <w:t xml:space="preserve">  name: devpod</w:t>
+        <w:br/>
+        <w:t xml:space="preserve">  labels:</w:t>
+        <w:br/>
+        <w:t xml:space="preserve">    app.kubernetes.io/name: devpod</w:t>
+        <w:br/>
+        <w:t xml:space="preserve">    app.kubernetes.io/part-of: homelab-dev</w:t>
       </w:r>
     </w:p>
     <w:p>
@@ -1199,12 +2082,672 @@
         <w:pStyle w:val="Heading1"/>
       </w:pPr>
       <w:r>
-        <w:t>6. M5 DevPod provider (skynet)</w:t>
+        <w:t>6. File: apps/base/devpod/resourcequota.yaml</w:t>
       </w:r>
     </w:p>
     <w:p>
       <w:r>
-        <w:t>Provider options (current):</w:t>
+        <w:t>Caps CPU, memory, storage, PVCs, pods and services in ns/devpod (storage hard limit 3Ti).</w:t>
+      </w:r>
+    </w:p>
+    <w:p>
+      <w:pPr>
+        <w:pStyle w:val="Heading3"/>
+      </w:pPr>
+      <w:r>
+        <w:t>Full file</w:t>
+      </w:r>
+    </w:p>
+    <w:p>
+      <w:pPr>
+        <w:keepLines/>
+        <w:spacing w:line="240" w:lineRule="auto" w:before="40" w:after="180"/>
+        <w:ind w:left="86" w:right="86"/>
+        <w:shd w:val="clear" w:color="auto" w:fill="F0F4F7"/>
+      </w:pPr>
+      <w:r>
+        <w:rPr>
+          <w:rFonts w:ascii="Consolas" w:hAnsi="Consolas" w:eastAsia="Consolas"/>
+          <w:color w:val="000000"/>
+          <w:sz w:val="19"/>
+        </w:rPr>
+        <w:t>apiVersion: v1</w:t>
+        <w:br/>
+        <w:t>kind: ResourceQuota</w:t>
+        <w:br/>
+        <w:t>metadata:</w:t>
+        <w:br/>
+        <w:t xml:space="preserve">  name: devpod-quota</w:t>
+        <w:br/>
+        <w:t xml:space="preserve">  namespace: devpod</w:t>
+        <w:br/>
+        <w:t>spec:</w:t>
+        <w:br/>
+        <w:t xml:space="preserve">  hard:</w:t>
+        <w:br/>
+        <w:t xml:space="preserve">    requests.cpu: "4"</w:t>
+        <w:br/>
+        <w:t xml:space="preserve">    requests.memory: 8Gi</w:t>
+        <w:br/>
+        <w:t xml:space="preserve">    limits.cpu: "8"</w:t>
+        <w:br/>
+        <w:t xml:space="preserve">    limits.memory: 16Gi</w:t>
+        <w:br/>
+        <w:t xml:space="preserve">    requests.storage: 3Ti</w:t>
+        <w:br/>
+        <w:t xml:space="preserve">    persistentvolumeclaims: "8"</w:t>
+        <w:br/>
+        <w:t xml:space="preserve">    pods: "20"</w:t>
+        <w:br/>
+        <w:t xml:space="preserve">    services: "10"</w:t>
+      </w:r>
+    </w:p>
+    <w:p>
+      <w:pPr>
+        <w:pStyle w:val="Heading1"/>
+      </w:pPr>
+      <w:r>
+        <w:t>7. File: apps/base/devpod/limitrange.yaml</w:t>
+      </w:r>
+    </w:p>
+    <w:p>
+      <w:r>
+        <w:t>Default and max container requests/limits; PVC max 2Ti / min 1Gi.</w:t>
+      </w:r>
+    </w:p>
+    <w:p>
+      <w:pPr>
+        <w:pStyle w:val="Heading3"/>
+      </w:pPr>
+      <w:r>
+        <w:t>Full file</w:t>
+      </w:r>
+    </w:p>
+    <w:p>
+      <w:pPr>
+        <w:spacing w:line="240" w:lineRule="auto" w:before="40" w:after="180"/>
+        <w:ind w:left="86" w:right="86"/>
+        <w:shd w:val="clear" w:color="auto" w:fill="F0F4F7"/>
+      </w:pPr>
+      <w:r>
+        <w:rPr>
+          <w:rFonts w:ascii="Consolas" w:hAnsi="Consolas" w:eastAsia="Consolas"/>
+          <w:color w:val="000000"/>
+          <w:sz w:val="19"/>
+        </w:rPr>
+        <w:t>apiVersion: v1</w:t>
+        <w:br/>
+        <w:t>kind: LimitRange</w:t>
+        <w:br/>
+        <w:t>metadata:</w:t>
+        <w:br/>
+        <w:t xml:space="preserve">  name: devpod-limits</w:t>
+        <w:br/>
+        <w:t xml:space="preserve">  namespace: devpod</w:t>
+        <w:br/>
+        <w:t>spec:</w:t>
+        <w:br/>
+        <w:t xml:space="preserve">  limits:</w:t>
+        <w:br/>
+        <w:t xml:space="preserve">    - type: Container</w:t>
+        <w:br/>
+        <w:t xml:space="preserve">      defaultRequest:</w:t>
+        <w:br/>
+        <w:t xml:space="preserve">        cpu: 250m</w:t>
+        <w:br/>
+        <w:t xml:space="preserve">        memory: 512Mi</w:t>
+        <w:br/>
+        <w:t xml:space="preserve">      default:</w:t>
+        <w:br/>
+        <w:t xml:space="preserve">        cpu: "1"</w:t>
+        <w:br/>
+        <w:t xml:space="preserve">        memory: 2Gi</w:t>
+        <w:br/>
+        <w:t xml:space="preserve">      max:</w:t>
+        <w:br/>
+        <w:t xml:space="preserve">        cpu: "4"</w:t>
+        <w:br/>
+        <w:t xml:space="preserve">        memory: 8Gi</w:t>
+        <w:br/>
+        <w:t xml:space="preserve">    - type: PersistentVolumeClaim</w:t>
+        <w:br/>
+        <w:t xml:space="preserve">      max:</w:t>
+        <w:br/>
+        <w:t xml:space="preserve">        storage: 2Ti</w:t>
+        <w:br/>
+        <w:t xml:space="preserve">      min:</w:t>
+        <w:br/>
+        <w:t xml:space="preserve">        storage: 1Gi</w:t>
+      </w:r>
+    </w:p>
+    <w:p>
+      <w:pPr>
+        <w:pStyle w:val="Heading1"/>
+      </w:pPr>
+      <w:r>
+        <w:t>8. File: apps/base/devpod/devpod-scratch-pvc.yaml</w:t>
+      </w:r>
+    </w:p>
+    <w:p>
+      <w:r>
+        <w:t>Standing 500Gi RWX scratch claim on smb-32tb-devstorage (shared across workspaces at /scratch).</w:t>
+      </w:r>
+    </w:p>
+    <w:p>
+      <w:pPr>
+        <w:shd w:val="clear" w:color="auto" w:fill="D3DFEE"/>
+        <w:keepLines/>
+        <w:pBdr>
+          <w:left w:val="single" w:sz="24" w:space="6" w:color="4F81BD"/>
+        </w:pBdr>
+        <w:spacing w:before="40" w:after="180"/>
+        <w:ind w:left="115" w:right="86"/>
+      </w:pPr>
+      <w:r>
+        <w:rPr>
+          <w:b/>
+          <w:color w:val="173A53"/>
+        </w:rPr>
+        <w:t xml:space="preserve">Note  </w:t>
+      </w:r>
+      <w:r>
+        <w:rPr>
+          <w:color w:val="1A1A1A"/>
+        </w:rPr>
+        <w:t>Shared RWX. Disposable only — never databases or sole copies of source.</w:t>
+      </w:r>
+    </w:p>
+    <w:p>
+      <w:pPr>
+        <w:pStyle w:val="Heading3"/>
+      </w:pPr>
+      <w:r>
+        <w:t>Full file</w:t>
+      </w:r>
+    </w:p>
+    <w:p>
+      <w:pPr>
+        <w:keepLines/>
+        <w:spacing w:line="240" w:lineRule="auto" w:before="40" w:after="180"/>
+        <w:ind w:left="86" w:right="86"/>
+        <w:shd w:val="clear" w:color="auto" w:fill="F0F4F7"/>
+      </w:pPr>
+      <w:r>
+        <w:rPr>
+          <w:rFonts w:ascii="Consolas" w:hAnsi="Consolas" w:eastAsia="Consolas"/>
+          <w:color w:val="000000"/>
+          <w:sz w:val="19"/>
+        </w:rPr>
+        <w:t>apiVersion: v1</w:t>
+        <w:br/>
+        <w:t>kind: PersistentVolumeClaim</w:t>
+        <w:br/>
+        <w:t>metadata:</w:t>
+        <w:br/>
+        <w:t xml:space="preserve">  name: devpod-scratch</w:t>
+        <w:br/>
+        <w:t xml:space="preserve">  namespace: devpod</w:t>
+        <w:br/>
+        <w:t xml:space="preserve">  labels:</w:t>
+        <w:br/>
+        <w:t xml:space="preserve">    app.kubernetes.io/name: devpod-scratch</w:t>
+        <w:br/>
+        <w:t xml:space="preserve">    app.kubernetes.io/part-of: homelab-dev</w:t>
+        <w:br/>
+        <w:t>spec:</w:t>
+        <w:br/>
+        <w:t xml:space="preserve">  accessModes:</w:t>
+        <w:br/>
+        <w:t xml:space="preserve">    - ReadWriteMany</w:t>
+        <w:br/>
+        <w:t xml:space="preserve">  resources:</w:t>
+        <w:br/>
+        <w:t xml:space="preserve">    requests:</w:t>
+        <w:br/>
+        <w:t xml:space="preserve">      storage: 500Gi</w:t>
+        <w:br/>
+        <w:t xml:space="preserve">  storageClassName: smb-32tb-devstorage</w:t>
+      </w:r>
+    </w:p>
+    <w:p>
+      <w:pPr>
+        <w:pStyle w:val="Heading1"/>
+      </w:pPr>
+      <w:r>
+        <w:t>9. File: infrastructure/controllers/base/csi-smb/storage-class-32tb.yaml</w:t>
+      </w:r>
+    </w:p>
+    <w:p>
+      <w:r>
+        <w:t>CSI-SMB StorageClass smb-32tb: direct to the 32TB_SSD appliance share G (not via the mini).</w:t>
+      </w:r>
+    </w:p>
+    <w:p>
+      <w:pPr>
+        <w:pStyle w:val="Heading3"/>
+      </w:pPr>
+      <w:r>
+        <w:t>Full file</w:t>
+      </w:r>
+    </w:p>
+    <w:p>
+      <w:pPr>
+        <w:spacing w:line="240" w:lineRule="auto" w:before="40" w:after="180"/>
+        <w:ind w:left="86" w:right="86"/>
+        <w:shd w:val="clear" w:color="auto" w:fill="F0F4F7"/>
+      </w:pPr>
+      <w:r>
+        <w:rPr>
+          <w:rFonts w:ascii="Consolas" w:hAnsi="Consolas" w:eastAsia="Consolas"/>
+          <w:color w:val="000000"/>
+          <w:sz w:val="19"/>
+        </w:rPr>
+        <w:t>apiVersion: storage.k8s.io/v1</w:t>
+        <w:br/>
+        <w:t>kind: StorageClass</w:t>
+        <w:br/>
+        <w:t>metadata:</w:t>
+        <w:br/>
+        <w:t xml:space="preserve">  name: smb-32tb</w:t>
+        <w:br/>
+        <w:t>provisioner: smb.csi.k8s.io</w:t>
+        <w:br/>
+        <w:t>parameters:</w:t>
+        <w:br/>
+        <w:t xml:space="preserve">  # Direct to the 32TB_SSD appliance (share G). Avoids double SMB via the mini.</w:t>
+        <w:br/>
+        <w:t xml:space="preserve">  source: //192.168.71.249/G</w:t>
+        <w:br/>
+        <w:t xml:space="preserve">  onDelete: retain</w:t>
+        <w:br/>
+        <w:t xml:space="preserve">  csi.storage.k8s.io/provisioner-secret-name: smb-32tb-credentials</w:t>
+        <w:br/>
+        <w:t xml:space="preserve">  csi.storage.k8s.io/provisioner-secret-namespace: devpod</w:t>
+        <w:br/>
+        <w:t xml:space="preserve">  csi.storage.k8s.io/node-stage-secret-name: smb-32tb-credentials</w:t>
+        <w:br/>
+        <w:t xml:space="preserve">  csi.storage.k8s.io/node-stage-secret-namespace: devpod</w:t>
+        <w:br/>
+        <w:t>reclaimPolicy: Retain</w:t>
+        <w:br/>
+        <w:t>allowVolumeExpansion: true</w:t>
+        <w:br/>
+        <w:t>volumeBindingMode: Immediate</w:t>
+        <w:br/>
+        <w:t>mountOptions:</w:t>
+        <w:br/>
+        <w:t xml:space="preserve">  - dir_mode=0770</w:t>
+        <w:br/>
+        <w:t xml:space="preserve">  - file_mode=0660</w:t>
+        <w:br/>
+        <w:t xml:space="preserve">  - uid=1000</w:t>
+        <w:br/>
+        <w:t xml:space="preserve">  - gid=1000</w:t>
+        <w:br/>
+        <w:t xml:space="preserve">  - noperm</w:t>
+        <w:br/>
+        <w:t xml:space="preserve">  - mfsymlinks</w:t>
+        <w:br/>
+        <w:t xml:space="preserve">  - cache=strict</w:t>
+        <w:br/>
+        <w:t xml:space="preserve">  - noserverino</w:t>
+      </w:r>
+    </w:p>
+    <w:p>
+      <w:pPr>
+        <w:pStyle w:val="Heading1"/>
+      </w:pPr>
+      <w:r>
+        <w:t>10. File: infrastructure/controllers/base/csi-smb/storage-class-32tb-devstorage.yaml</w:t>
+      </w:r>
+    </w:p>
+    <w:p>
+      <w:r>
+        <w:t>CSI-SMB StorageClass smb-32tb-devstorage: //192.168.71.249/G/DevStorage scratch root.</w:t>
+      </w:r>
+    </w:p>
+    <w:p>
+      <w:pPr>
+        <w:pStyle w:val="Heading3"/>
+      </w:pPr>
+      <w:r>
+        <w:t>Full file</w:t>
+      </w:r>
+    </w:p>
+    <w:p>
+      <w:pPr>
+        <w:spacing w:line="240" w:lineRule="auto" w:before="40" w:after="180"/>
+        <w:ind w:left="86" w:right="86"/>
+        <w:shd w:val="clear" w:color="auto" w:fill="F0F4F7"/>
+      </w:pPr>
+      <w:r>
+        <w:rPr>
+          <w:rFonts w:ascii="Consolas" w:hAnsi="Consolas" w:eastAsia="Consolas"/>
+          <w:color w:val="000000"/>
+          <w:sz w:val="19"/>
+        </w:rPr>
+        <w:t>apiVersion: storage.k8s.io/v1</w:t>
+        <w:br/>
+        <w:t>kind: StorageClass</w:t>
+        <w:br/>
+        <w:t>metadata:</w:t>
+        <w:br/>
+        <w:t xml:space="preserve">  name: smb-32tb-devstorage</w:t>
+        <w:br/>
+        <w:t>provisioner: smb.csi.k8s.io</w:t>
+        <w:br/>
+        <w:t>parameters:</w:t>
+        <w:br/>
+        <w:t xml:space="preserve">  # Scratch root on the 32TB_SSD appliance</w:t>
+        <w:br/>
+        <w:t xml:space="preserve">  source: //192.168.71.249/G/DevStorage</w:t>
+        <w:br/>
+        <w:t xml:space="preserve">  onDelete: retain</w:t>
+        <w:br/>
+        <w:t xml:space="preserve">  csi.storage.k8s.io/provisioner-secret-name: smb-32tb-credentials</w:t>
+        <w:br/>
+        <w:t xml:space="preserve">  csi.storage.k8s.io/provisioner-secret-namespace: devpod</w:t>
+        <w:br/>
+        <w:t xml:space="preserve">  csi.storage.k8s.io/node-stage-secret-name: smb-32tb-credentials</w:t>
+        <w:br/>
+        <w:t xml:space="preserve">  csi.storage.k8s.io/node-stage-secret-namespace: devpod</w:t>
+        <w:br/>
+        <w:t>reclaimPolicy: Retain</w:t>
+        <w:br/>
+        <w:t>allowVolumeExpansion: true</w:t>
+        <w:br/>
+        <w:t>volumeBindingMode: Immediate</w:t>
+        <w:br/>
+        <w:t>mountOptions:</w:t>
+        <w:br/>
+        <w:t xml:space="preserve">  - dir_mode=0770</w:t>
+        <w:br/>
+        <w:t xml:space="preserve">  - file_mode=0660</w:t>
+        <w:br/>
+        <w:t xml:space="preserve">  - uid=1000</w:t>
+        <w:br/>
+        <w:t xml:space="preserve">  - gid=1000</w:t>
+        <w:br/>
+        <w:t xml:space="preserve">  - noperm</w:t>
+        <w:br/>
+        <w:t xml:space="preserve">  - mfsymlinks</w:t>
+        <w:br/>
+        <w:t xml:space="preserve">  - cache=strict</w:t>
+        <w:br/>
+        <w:t xml:space="preserve">  - noserverino</w:t>
+      </w:r>
+    </w:p>
+    <w:p>
+      <w:pPr>
+        <w:pStyle w:val="Heading1"/>
+      </w:pPr>
+      <w:r>
+        <w:t>11. File: apps/base/devpod/kustomization.yaml</w:t>
+      </w:r>
+    </w:p>
+    <w:p>
+      <w:r>
+        <w:t>Base kustomization listing namespace, quota, limits, scratch PVC, and later StatefulSet-era resources.</w:t>
+      </w:r>
+    </w:p>
+    <w:p>
+      <w:pPr>
+        <w:shd w:val="clear" w:color="auto" w:fill="D3DFEE"/>
+        <w:keepLines/>
+        <w:pBdr>
+          <w:left w:val="single" w:sz="24" w:space="6" w:color="4F81BD"/>
+        </w:pBdr>
+        <w:spacing w:before="40" w:after="180"/>
+        <w:ind w:left="115" w:right="86"/>
+      </w:pPr>
+      <w:r>
+        <w:rPr>
+          <w:b/>
+          <w:color w:val="173A53"/>
+        </w:rPr>
+        <w:t xml:space="preserve">Note  </w:t>
+      </w:r>
+      <w:r>
+        <w:rPr>
+          <w:color w:val="1A1A1A"/>
+        </w:rPr>
+        <w:t>service.yaml, serviceaccount, clusterrolebinding, StatefulSet, nodeport-controller, and bootstrap ConfigMap arrived in later commits. Full contents of those files are in the DevPod Enhancements / NodePort / Bootstrap addenda. This runbook still ships the live kustomization so a rebuild matches Git.</w:t>
+      </w:r>
+    </w:p>
+    <w:p>
+      <w:pPr>
+        <w:pStyle w:val="Heading3"/>
+      </w:pPr>
+      <w:r>
+        <w:t>Full file</w:t>
+      </w:r>
+    </w:p>
+    <w:p>
+      <w:pPr>
+        <w:spacing w:line="240" w:lineRule="auto" w:before="40" w:after="180"/>
+        <w:ind w:left="86" w:right="86"/>
+        <w:shd w:val="clear" w:color="auto" w:fill="F0F4F7"/>
+      </w:pPr>
+      <w:r>
+        <w:rPr>
+          <w:rFonts w:ascii="Consolas" w:hAnsi="Consolas" w:eastAsia="Consolas"/>
+          <w:color w:val="000000"/>
+          <w:sz w:val="19"/>
+        </w:rPr>
+        <w:t>apiVersion: kustomize.config.k8s.io/v1beta1</w:t>
+        <w:br/>
+        <w:t>kind: Kustomization</w:t>
+        <w:br/>
+        <w:t>resources:</w:t>
+        <w:br/>
+        <w:t xml:space="preserve">  - namespace.yaml</w:t>
+        <w:br/>
+        <w:t xml:space="preserve">  - resourcequota.yaml</w:t>
+        <w:br/>
+        <w:t xml:space="preserve">  - limitrange.yaml</w:t>
+        <w:br/>
+        <w:t xml:space="preserve">  - devpod-scratch-pvc.yaml</w:t>
+        <w:br/>
+        <w:t xml:space="preserve">  - service.yaml</w:t>
+        <w:br/>
+        <w:t xml:space="preserve">  - serviceaccount-devpod.yaml</w:t>
+        <w:br/>
+        <w:t xml:space="preserve">  - clusterrolebinding-devpod-admin.yaml</w:t>
+        <w:br/>
+        <w:t xml:space="preserve">  - devpod-statefulset.yaml</w:t>
+        <w:br/>
+        <w:t xml:space="preserve">  - nodeport-controller.yaml</w:t>
+        <w:br/>
+        <w:t>configMapGenerator:</w:t>
+        <w:br/>
+        <w:t xml:space="preserve">  # Bootstrap scripts for every DevPod replica. The name gets a content</w:t>
+        <w:br/>
+        <w:t xml:space="preserve">  # hash, so editing a script rolls the StatefulSet. No secrets here.</w:t>
+        <w:br/>
+        <w:t xml:space="preserve">  - name: devpod-bootstrap</w:t>
+        <w:br/>
+        <w:t xml:space="preserve">    namespace: devpod</w:t>
+        <w:br/>
+        <w:t xml:space="preserve">    files:</w:t>
+        <w:br/>
+        <w:t xml:space="preserve">      - bootstrap/bootstrap.sh</w:t>
+        <w:br/>
+        <w:t xml:space="preserve">      - bootstrap/devpod-runtime.sh</w:t>
+        <w:br/>
+        <w:t xml:space="preserve">      - bootstrap/git-credential-devpod</w:t>
+        <w:br/>
+        <w:t xml:space="preserve">      - bootstrap/devpod-brew.sh</w:t>
+        <w:br/>
+        <w:t xml:space="preserve">      - bootstrap/authorized_keys</w:t>
+      </w:r>
+    </w:p>
+    <w:p>
+      <w:pPr>
+        <w:pStyle w:val="Heading1"/>
+      </w:pPr>
+      <w:r>
+        <w:t>12. File: apps/staging/devpod/kustomization.yaml</w:t>
+      </w:r>
+    </w:p>
+    <w:p>
+      <w:r>
+        <w:t>Staging overlay: pulls base/devpod and the SOPS-encrypted credential Secrets.</w:t>
+      </w:r>
+    </w:p>
+    <w:p>
+      <w:pPr>
+        <w:shd w:val="clear" w:color="auto" w:fill="D3DFEE"/>
+        <w:keepLines/>
+        <w:pBdr>
+          <w:left w:val="single" w:sz="24" w:space="6" w:color="4F81BD"/>
+        </w:pBdr>
+        <w:spacing w:before="40" w:after="180"/>
+        <w:ind w:left="115" w:right="86"/>
+      </w:pPr>
+      <w:r>
+        <w:rPr>
+          <w:b/>
+          <w:color w:val="173A53"/>
+        </w:rPr>
+        <w:t xml:space="preserve">Note  </w:t>
+      </w:r>
+      <w:r>
+        <w:rPr>
+          <w:color w:val="1A1A1A"/>
+        </w:rPr>
+        <w:t>smb-32tb-credentials.yaml and github-credentials.yaml are SOPS-encrypted. They are not reproduced here. Recreate from the placeholder in Appendix A, encrypt with age, then git add.</w:t>
+      </w:r>
+    </w:p>
+    <w:p>
+      <w:pPr>
+        <w:pStyle w:val="Heading3"/>
+      </w:pPr>
+      <w:r>
+        <w:t>Full file</w:t>
+      </w:r>
+    </w:p>
+    <w:p>
+      <w:pPr>
+        <w:keepLines/>
+        <w:spacing w:line="240" w:lineRule="auto" w:before="40" w:after="180"/>
+        <w:ind w:left="86" w:right="86"/>
+        <w:shd w:val="clear" w:color="auto" w:fill="F0F4F7"/>
+      </w:pPr>
+      <w:r>
+        <w:rPr>
+          <w:rFonts w:ascii="Consolas" w:hAnsi="Consolas" w:eastAsia="Consolas"/>
+          <w:color w:val="000000"/>
+          <w:sz w:val="19"/>
+        </w:rPr>
+        <w:t>apiVersion: kustomize.config.k8s.io/v1beta1</w:t>
+        <w:br/>
+        <w:t>kind: Kustomization</w:t>
+        <w:br/>
+        <w:t>namespace: devpod</w:t>
+        <w:br/>
+        <w:t>resources:</w:t>
+        <w:br/>
+        <w:t xml:space="preserve">  - ../../base/devpod/</w:t>
+        <w:br/>
+        <w:t xml:space="preserve">  - smb-32tb-credentials.yaml</w:t>
+        <w:br/>
+        <w:t xml:space="preserve">  - github-credentials.yaml</w:t>
+      </w:r>
+    </w:p>
+    <w:p>
+      <w:pPr>
+        <w:pStyle w:val="Heading1"/>
+      </w:pPr>
+      <w:r>
+        <w:t>13. File: ~/.config/devpod/skynet-pod-template.yaml (M5)</w:t>
+      </w:r>
+    </w:p>
+    <w:p>
+      <w:r>
+        <w:t>DevPod POD_MANIFEST_TEMPLATE: mounts the standing scratch PVC at /scratch for every skynet workspace.</w:t>
+      </w:r>
+    </w:p>
+    <w:p>
+      <w:pPr>
+        <w:shd w:val="clear" w:color="auto" w:fill="D3DFEE"/>
+        <w:keepLines/>
+        <w:pBdr>
+          <w:left w:val="single" w:sz="24" w:space="6" w:color="4F81BD"/>
+        </w:pBdr>
+        <w:spacing w:before="40" w:after="180"/>
+        <w:ind w:left="115" w:right="86"/>
+      </w:pPr>
+      <w:r>
+        <w:rPr>
+          <w:b/>
+          <w:color w:val="173A53"/>
+        </w:rPr>
+        <w:t xml:space="preserve">Note  </w:t>
+      </w:r>
+      <w:r>
+        <w:rPr>
+          <w:color w:val="1A1A1A"/>
+        </w:rPr>
+        <w:t>Lives on the M5 under cyberstar's home, not in the GitOps repo. Recreate this file before pointing the provider at it.</w:t>
+      </w:r>
+    </w:p>
+    <w:p>
+      <w:pPr>
+        <w:pStyle w:val="Heading3"/>
+      </w:pPr>
+      <w:r>
+        <w:t>Full file</w:t>
+      </w:r>
+    </w:p>
+    <w:p>
+      <w:pPr>
+        <w:keepLines/>
+        <w:spacing w:line="240" w:lineRule="auto" w:before="40" w:after="180"/>
+        <w:ind w:left="86" w:right="86"/>
+        <w:shd w:val="clear" w:color="auto" w:fill="F0F4F7"/>
+      </w:pPr>
+      <w:r>
+        <w:rPr>
+          <w:rFonts w:ascii="Consolas" w:hAnsi="Consolas" w:eastAsia="Consolas"/>
+          <w:color w:val="000000"/>
+          <w:sz w:val="19"/>
+        </w:rPr>
+        <w:t>apiVersion: v1</w:t>
+        <w:br/>
+        <w:t>kind: Pod</w:t>
+        <w:br/>
+        <w:t>spec:</w:t>
+        <w:br/>
+        <w:t xml:space="preserve">  containers:</w:t>
+        <w:br/>
+        <w:t xml:space="preserve">    - name: devpod</w:t>
+        <w:br/>
+        <w:t xml:space="preserve">      volumeMounts:</w:t>
+        <w:br/>
+        <w:t xml:space="preserve">        - name: devpod-scratch</w:t>
+        <w:br/>
+        <w:t xml:space="preserve">          mountPath: /scratch</w:t>
+        <w:br/>
+        <w:t xml:space="preserve">  volumes:</w:t>
+        <w:br/>
+        <w:t xml:space="preserve">    - name: devpod-scratch</w:t>
+        <w:br/>
+        <w:t xml:space="preserve">      persistentVolumeClaim:</w:t>
+        <w:br/>
+        <w:t xml:space="preserve">        claimName: devpod-scratch</w:t>
+      </w:r>
+    </w:p>
+    <w:p>
+      <w:pPr>
+        <w:pStyle w:val="Heading1"/>
+      </w:pPr>
+      <w:r>
+        <w:t>14. M5 DevPod provider (skynet)</w:t>
+      </w:r>
+    </w:p>
+    <w:p>
+      <w:r>
+        <w:t>Provider options (as of the 2026-09-12–13 standup):</w:t>
       </w:r>
     </w:p>
     <w:tbl>
@@ -1730,49 +3273,6 @@
     </w:p>
     <w:p>
       <w:r>
-        <w:t>Pod template (scratch mount):</w:t>
-      </w:r>
-    </w:p>
-    <w:p>
-      <w:pPr>
-        <w:keepLines/>
-        <w:spacing w:line="240" w:lineRule="auto" w:before="40" w:after="180"/>
-        <w:ind w:left="86" w:right="86"/>
-        <w:shd w:val="clear" w:color="auto" w:fill="F0F4F7"/>
-      </w:pPr>
-      <w:r>
-        <w:rPr>
-          <w:rFonts w:ascii="Consolas" w:hAnsi="Consolas" w:eastAsia="Consolas"/>
-          <w:color w:val="000000"/>
-          <w:sz w:val="19"/>
-        </w:rPr>
-        <w:t>apiVersion: v1</w:t>
-        <w:br/>
-        <w:t>kind: Pod</w:t>
-        <w:br/>
-        <w:t>spec:</w:t>
-        <w:br/>
-        <w:t xml:space="preserve">  containers:</w:t>
-        <w:br/>
-        <w:t xml:space="preserve">    - name: devpod</w:t>
-        <w:br/>
-        <w:t xml:space="preserve">      volumeMounts:</w:t>
-        <w:br/>
-        <w:t xml:space="preserve">        - name: devpod-scratch</w:t>
-        <w:br/>
-        <w:t xml:space="preserve">          mountPath: /scratch</w:t>
-        <w:br/>
-        <w:t xml:space="preserve">  volumes:</w:t>
-        <w:br/>
-        <w:t xml:space="preserve">    - name: devpod-scratch</w:t>
-        <w:br/>
-        <w:t xml:space="preserve">      persistentVolumeClaim:</w:t>
-        <w:br/>
-        <w:t xml:space="preserve">        claimName: devpod-scratch</w:t>
-      </w:r>
-    </w:p>
-    <w:p>
-      <w:r>
         <w:t>CLI PATH note: prefer /opt/homebrew/bin/devpod (also ~/.local/bin/devpod). If `command not found`, hash -r or use the full path.</w:t>
       </w:r>
     </w:p>
@@ -1781,7 +3281,7 @@
         <w:pStyle w:val="Heading1"/>
       </w:pPr>
       <w:r>
-        <w:t>7. Day-to-day: create / enter a workspace</w:t>
+        <w:t>15. Day-to-day: create / enter a workspace</w:t>
       </w:r>
     </w:p>
     <w:p>
@@ -1789,7 +3289,7 @@
         <w:pStyle w:val="Heading2"/>
       </w:pPr>
       <w:r>
-        <w:t>7.1 Create or resume</w:t>
+        <w:t>15.1 Create or resume</w:t>
       </w:r>
     </w:p>
     <w:p>
@@ -1826,7 +3326,7 @@
         <w:pStyle w:val="Heading2"/>
       </w:pPr>
       <w:r>
-        <w:t>7.2 SSH + vim (preferred)</w:t>
+        <w:t>15.2 SSH + vim (preferred)</w:t>
       </w:r>
     </w:p>
     <w:p>
@@ -1863,7 +3363,7 @@
         <w:pStyle w:val="Heading2"/>
       </w:pPr>
       <w:r>
-        <w:t>7.3 Useful checks</w:t>
+        <w:t>15.3 Useful checks</w:t>
       </w:r>
     </w:p>
     <w:p>
@@ -1891,7 +3391,7 @@
         <w:pStyle w:val="Heading1"/>
       </w:pPr>
       <w:r>
-        <w:t>8. Example workspace: cluster-dashboard</w:t>
+        <w:t>16. Example workspace: cluster-dashboard</w:t>
       </w:r>
     </w:p>
     <w:p>
@@ -1915,7 +3415,7 @@
         <w:pStyle w:val="ListBullet"/>
       </w:pPr>
       <w:r>
-        <w:t>Observed: pod devpod-default-cl-403e3 Running; PVC 40Gi Longhorn Bound; shared scratch Bound.</w:t>
+        <w:t>Observed 2026-09-12: pod Running; PVC 40Gi Longhorn Bound; shared scratch Bound.</w:t>
       </w:r>
     </w:p>
     <w:p>
@@ -1931,17 +3431,17 @@
         <w:pStyle w:val="Heading1"/>
       </w:pPr>
       <w:r>
-        <w:t>9. Cursor Remote-SSH (optional)</w:t>
+        <w:t>17. Cursor Remote-SSH (optional)</w:t>
       </w:r>
     </w:p>
     <w:p>
       <w:r>
-        <w:t>Cursor can Remote-SSH to cluster-dashboard.devpod. First connect downloads/extracts ~/.cursor-server (~0.5–1 GiB) onto the container overlay (node disk), not the Longhorn workspace PVC. A stuck “Extracting…” state was observed; the server tarball had finished unpacking while the install heartbeat loop kept running. Recovery: kill the stuck install SSH, clear /tmp/cursor-remote-lock.*, remove leftover cursor-server-*.tar.gz under ~/.cursor-server, reconnect — or skip Cursor and use vim.</w:t>
+        <w:t>Cursor can Remote-SSH to cluster-dashboard.devpod. First connect downloads/extracts ~/.cursor-server (~0.5–1 GiB) onto the container overlay (node disk), not the Longhorn workspace PVC. See section 1 for the stuck-Extracting recovery. Prefer vim for day-to-day.</w:t>
       </w:r>
     </w:p>
     <w:p>
       <w:r>
-        <w:t>Disk reality check (2026-09-12 evening): workspace PVC nearly empty; node root ~26% used; /scratch nearly empty. “Disk full” was not confirmed on the DevPod mounts.</w:t>
+        <w:t>Disk reality check (2026-09-12 evening): workspace PVC nearly empty; node root ~26% used; /scratch nearly empty. "Disk full" was not confirmed on the DevPod mounts.</w:t>
       </w:r>
     </w:p>
     <w:p>
@@ -1949,7 +3449,7 @@
         <w:pStyle w:val="Heading1"/>
       </w:pPr>
       <w:r>
-        <w:t>10. Deferred — development documentation (app runtime)</w:t>
+        <w:t>18. Deferred — development documentation (app runtime)</w:t>
       </w:r>
     </w:p>
     <w:p>
@@ -1994,7 +3494,7 @@
         <w:pStyle w:val="Heading1"/>
       </w:pPr>
       <w:r>
-        <w:t>11. Operational notes</w:t>
+        <w:t>19. Operational notes</w:t>
       </w:r>
     </w:p>
     <w:p>
@@ -2002,7 +3502,7 @@
         <w:pStyle w:val="ListBullet"/>
       </w:pPr>
       <w:r>
-        <w:t>Deleting a DevPod workspace may delete its Longhorn PVC depending on DevPod delete flags — confirm before destroy.</w:t>
+        <w:t>Kube API must be reachable from M5 at 192.168.68.40:6443 (earlier "no route to host" broke DevPod tunnels briefly).</w:t>
       </w:r>
     </w:p>
     <w:p>
@@ -2010,7 +3510,7 @@
         <w:pStyle w:val="ListBullet"/>
       </w:pPr>
       <w:r>
-        <w:t>Scratch is shared RWX across workspaces; do not put databases or sole copies of source there.</w:t>
+        <w:t>32TB path is CSI-direct to 192.168.71.249 (not hairpinned through the mini SMB export).</w:t>
       </w:r>
     </w:p>
     <w:p>
@@ -2018,7 +3518,7 @@
         <w:pStyle w:val="ListBullet"/>
       </w:pPr>
       <w:r>
-        <w:t>Kube API must be reachable from M5 at 192.168.68.40:6443 (earlier “no route to host” broke DevPod tunnels briefly).</w:t>
+        <w:t>Credentials for smb-32tb and GitHub tokens live in SOPS Secrets in ns/devpod — never commit plaintext.</w:t>
       </w:r>
     </w:p>
     <w:p>
@@ -2026,7 +3526,7 @@
         <w:pStyle w:val="ListBullet"/>
       </w:pPr>
       <w:r>
-        <w:t>32TB path is CSI-direct to 192.168.71.249 (not hairpinned through the mini SMB export), credentials via SOPS in ns devpod.</w:t>
+        <w:t>Later: Homelab_DevPod_Enhancements_Addendum.docx covers cluster-admin SA, SOPS age key mount, kubectl over SSH, Cloudflare SSH hosts, persistent host keys, and StatefulSet replicas.</w:t>
       </w:r>
     </w:p>
     <w:p>
@@ -2034,47 +3534,262 @@
         <w:pStyle w:val="Heading1"/>
       </w:pPr>
       <w:r>
-        <w:t>12. Recreate checklist</w:t>
+        <w:t>Appendix A. Restore and rebuild</w:t>
+      </w:r>
+    </w:p>
+    <w:p>
+      <w:r>
+        <w:t>1. Write sections 5–8 and 11 to apps/base/devpod/ (namespace, resourcequota, limitrange, scratch PVC, kustomization).</w:t>
+      </w:r>
+    </w:p>
+    <w:p>
+      <w:r>
+        <w:t>2. Write sections 9–10 under infrastructure/controllers/base/csi-smb/ and ensure that kustomization lists them (see Mirror runbook for the full CSI-SMB tree).</w:t>
+      </w:r>
+    </w:p>
+    <w:p>
+      <w:r>
+        <w:t>3. Write section 12 to apps/staging/devpod/kustomization.yaml. Recreate the two SOPS Secrets (smb-32tb-credentials, github-credentials); encrypt with age before git add. Placeholder shape for the SMB secret:</w:t>
       </w:r>
     </w:p>
     <w:p>
       <w:pPr>
-        <w:pStyle w:val="ListBullet"/>
+        <w:keepLines/>
+        <w:spacing w:line="240" w:lineRule="auto" w:before="40" w:after="180"/>
+        <w:ind w:left="86" w:right="86"/>
+        <w:shd w:val="clear" w:color="auto" w:fill="F0F4F7"/>
       </w:pPr>
       <w:r>
-        <w:t>Flux reconcile apps so ns/quota/SC/secret/scratch PVC exist.</w:t>
+        <w:rPr>
+          <w:rFonts w:ascii="Consolas" w:hAnsi="Consolas" w:eastAsia="Consolas"/>
+          <w:color w:val="000000"/>
+          <w:sz w:val="19"/>
+        </w:rPr>
+        <w:t>apiVersion: v1</w:t>
+        <w:br/>
+        <w:t>kind: Secret</w:t>
+        <w:br/>
+        <w:t>metadata:</w:t>
+        <w:br/>
+        <w:t xml:space="preserve">  name: smb-32tb-credentials</w:t>
+        <w:br/>
+        <w:t xml:space="preserve">  namespace: devpod</w:t>
+        <w:br/>
+        <w:t>type: Opaque</w:t>
+        <w:br/>
+        <w:t>stringData:</w:t>
+        <w:br/>
+        <w:t xml:space="preserve">  username: guest</w:t>
+        <w:br/>
+        <w:t xml:space="preserve">  password: ""</w:t>
+        <w:br/>
+        <w:t># Encrypt with SOPS (age) before git add. Live file is apps/staging/devpod/smb-32tb-credentials.yaml.</w:t>
+      </w:r>
+    </w:p>
+    <w:p>
+      <w:r>
+        <w:t>4. On the M5, write section 13 to ~/.config/devpod/skynet-pod-template.yaml and configure the skynet provider with the options in section 14.</w:t>
+      </w:r>
+    </w:p>
+    <w:p>
+      <w:r>
+        <w:t>5. Commit, push, reconcile Flux apps, then `devpod up &lt;repo&gt; --provider skynet --ide none` and verify with Appendix B.</w:t>
       </w:r>
     </w:p>
     <w:p>
       <w:pPr>
-        <w:pStyle w:val="ListBullet"/>
+        <w:shd w:val="clear" w:color="auto" w:fill="FBEAEA"/>
+        <w:keepLines/>
+        <w:pBdr>
+          <w:left w:val="single" w:sz="36" w:space="6" w:color="A52A23"/>
+        </w:pBdr>
+        <w:spacing w:before="40" w:after="180"/>
+        <w:ind w:left="144" w:right="86"/>
       </w:pPr>
       <w:r>
-        <w:t>On M5: install DevPod CLI; add kubernetes provider skynet with options above; install pod template.</w:t>
+        <w:rPr>
+          <w:rFonts w:ascii="Calibri" w:hAnsi="Calibri" w:eastAsia="Calibri"/>
+          <w:b/>
+          <w:color w:val="A52A23"/>
+        </w:rPr>
+        <w:t>CRITICAL — Never commit an unencrypted Secret.</w:t>
+      </w:r>
+      <w:r>
+        <w:br/>
+      </w:r>
+      <w:r>
+        <w:rPr>
+          <w:rFonts w:ascii="Calibri" w:hAnsi="Calibri" w:eastAsia="Calibri"/>
+          <w:b/>
+          <w:color w:val="A52A23"/>
+        </w:rPr>
+        <w:t>SOPS-encrypt smb-32tb-credentials and github-credentials before git add. Never paste tokens into this document, a ticket, or chat.</w:t>
       </w:r>
     </w:p>
     <w:p>
       <w:pPr>
-        <w:pStyle w:val="ListBullet"/>
+        <w:shd w:val="clear" w:color="auto" w:fill="FBEAEA"/>
+        <w:keepLines/>
+        <w:pBdr>
+          <w:left w:val="single" w:sz="36" w:space="6" w:color="A52A23"/>
+        </w:pBdr>
+        <w:spacing w:before="40" w:after="180"/>
+        <w:ind w:left="144" w:right="86"/>
       </w:pPr>
       <w:r>
-        <w:t>devpod up &lt;repo&gt; --provider skynet --ide none</w:t>
+        <w:rPr>
+          <w:rFonts w:ascii="Calibri" w:hAnsi="Calibri" w:eastAsia="Calibri"/>
+          <w:b/>
+          <w:color w:val="A52A23"/>
+        </w:rPr>
+        <w:t>CRITICAL — Workspace PVC stays on Longhorn.</w:t>
+      </w:r>
+      <w:r>
+        <w:br/>
+      </w:r>
+      <w:r>
+        <w:rPr>
+          <w:rFonts w:ascii="Calibri" w:hAnsi="Calibri" w:eastAsia="Calibri"/>
+          <w:b/>
+          <w:color w:val="A52A23"/>
+        </w:rPr>
+        <w:t>Do not point STORAGE_CLASS at smb-32tb or smb-32tb-devstorage for the DevPod workspace disk. Those classes are for scratch/bulk only.</w:t>
       </w:r>
     </w:p>
     <w:p>
       <w:pPr>
-        <w:pStyle w:val="ListBullet"/>
+        <w:pStyle w:val="Heading1"/>
       </w:pPr>
       <w:r>
-        <w:t>ssh in; confirm amd64, /workspaces, /scratch; develop with vim.</w:t>
+        <w:t>Appendix B. kubectl and Linux commands</w:t>
       </w:r>
     </w:p>
     <w:p>
       <w:pPr>
-        <w:pStyle w:val="ListBullet"/>
+        <w:pStyle w:val="Heading2"/>
       </w:pPr>
       <w:r>
-        <w:t>Later: follow development docs for uvicorn + Ingress.</w:t>
+        <w:t>B.1 Flux / namespace</w:t>
+      </w:r>
+    </w:p>
+    <w:p>
+      <w:pPr>
+        <w:keepLines/>
+        <w:spacing w:line="240" w:lineRule="auto" w:before="40" w:after="180"/>
+        <w:ind w:left="86" w:right="86"/>
+        <w:shd w:val="clear" w:color="auto" w:fill="F0F4F7"/>
+      </w:pPr>
+      <w:r>
+        <w:rPr>
+          <w:rFonts w:ascii="Consolas" w:hAnsi="Consolas" w:eastAsia="Consolas"/>
+          <w:color w:val="000000"/>
+          <w:sz w:val="19"/>
+        </w:rPr>
+        <w:t>kubectl -n devpod get ns,resourcequota,limitrange,pvc,sa,rolebinding,clusterrolebinding</w:t>
+        <w:br/>
+        <w:t>kubectl get sc | egrep 'longhorn|smb'</w:t>
+        <w:br/>
+        <w:t>flux reconcile kustomization apps -n flux-system --with-source</w:t>
+        <w:br/>
+        <w:t>flux get kustomizations -A | egrep 'devpod|apps'</w:t>
+      </w:r>
+    </w:p>
+    <w:p>
+      <w:pPr>
+        <w:pStyle w:val="Heading2"/>
+      </w:pPr>
+      <w:r>
+        <w:t>B.2 Scratch and mounts</w:t>
+      </w:r>
+    </w:p>
+    <w:p>
+      <w:pPr>
+        <w:keepLines/>
+        <w:spacing w:line="240" w:lineRule="auto" w:before="40" w:after="180"/>
+        <w:ind w:left="86" w:right="86"/>
+        <w:shd w:val="clear" w:color="auto" w:fill="F0F4F7"/>
+      </w:pPr>
+      <w:r>
+        <w:rPr>
+          <w:rFonts w:ascii="Consolas" w:hAnsi="Consolas" w:eastAsia="Consolas"/>
+          <w:color w:val="000000"/>
+          <w:sz w:val="19"/>
+        </w:rPr>
+        <w:t>kubectl -n devpod get pvc devpod-scratch -o wide</w:t>
+        <w:br/>
+        <w:t>kubectl -n devpod describe pvc devpod-scratch</w:t>
+        <w:br/>
+        <w:t># inside a workspace:</w:t>
+        <w:br/>
+        <w:t>df -h /workspaces /scratch</w:t>
+        <w:br/>
+        <w:t>mount | egrep 'workspaces|scratch'</w:t>
+      </w:r>
+    </w:p>
+    <w:p>
+      <w:pPr>
+        <w:pStyle w:val="Heading2"/>
+      </w:pPr>
+      <w:r>
+        <w:t>B.3 DevPod on M5</w:t>
+      </w:r>
+    </w:p>
+    <w:p>
+      <w:pPr>
+        <w:keepLines/>
+        <w:spacing w:line="240" w:lineRule="auto" w:before="40" w:after="180"/>
+        <w:ind w:left="86" w:right="86"/>
+        <w:shd w:val="clear" w:color="auto" w:fill="F0F4F7"/>
+      </w:pPr>
+      <w:r>
+        <w:rPr>
+          <w:rFonts w:ascii="Consolas" w:hAnsi="Consolas" w:eastAsia="Consolas"/>
+          <w:color w:val="000000"/>
+          <w:sz w:val="19"/>
+        </w:rPr>
+        <w:t>export PATH=/opt/homebrew/bin:$PATH</w:t>
+        <w:br/>
+        <w:t>devpod version</w:t>
+        <w:br/>
+        <w:t>devpod provider list</w:t>
+        <w:br/>
+        <w:t>devpod provider options skynet</w:t>
+        <w:br/>
+        <w:t>devpod list</w:t>
+        <w:br/>
+        <w:t>devpod up github.com/Invertedlight/cluster-dashboard --provider skynet --ide none</w:t>
+        <w:br/>
+        <w:t>devpod ssh cluster-dashboard</w:t>
+        <w:br/>
+        <w:t>ssh cluster-dashboard.devpod 'uname -m; df -h /workspaces /scratch'</w:t>
+      </w:r>
+    </w:p>
+    <w:p>
+      <w:pPr>
+        <w:pStyle w:val="Heading2"/>
+      </w:pPr>
+      <w:r>
+        <w:t>B.4 API reachability</w:t>
+      </w:r>
+    </w:p>
+    <w:p>
+      <w:pPr>
+        <w:keepLines/>
+        <w:spacing w:line="240" w:lineRule="auto" w:before="40" w:after="180"/>
+        <w:ind w:left="86" w:right="86"/>
+        <w:shd w:val="clear" w:color="auto" w:fill="F0F4F7"/>
+      </w:pPr>
+      <w:r>
+        <w:rPr>
+          <w:rFonts w:ascii="Consolas" w:hAnsi="Consolas" w:eastAsia="Consolas"/>
+          <w:color w:val="000000"/>
+          <w:sz w:val="19"/>
+        </w:rPr>
+        <w:t>kubectl cluster-info</w:t>
+        <w:br/>
+        <w:t>kubectl get --raw=/readyz?verbose</w:t>
+        <w:br/>
+        <w:t>nc -vz 192.168.68.40 6443</w:t>
       </w:r>
     </w:p>
     <w:sectPr>
@@ -2106,7 +3821,7 @@
         <w:color w:val="595959"/>
         <w:sz w:val="18"/>
       </w:rPr>
-      <w:t>Homelab DevPod on Skynet Runbook</w:t>
+      <w:t>Homelab DevPod on Skynet Runbook · 2026-09-12</w:t>
       <w:tab/>
     </w:r>
     <w:r>

</xml_diff>